<commit_message>
Highlight selected rows of A and B in task 1 explanation
Co-Authored-By: Claude Opus 5.5 <noreply@anthropic.com>
Claude-Session: https://claude.ai/code/session_01M8pUE3adzgGc2WqjPvNRzN
</commit_message>
<xml_diff>
--- a/Lab1/zadanie1_razbor.docx
+++ b/Lab1/zadanie1_razbor.docx
@@ -940,6 +940,487 @@
           <w:sz w:val="28"/>
           <w:szCs w:val="28"/>
         </w:rPr>
+        <w:t xml:space="preserve">Берем таблицу A целиком и условно отмечаем первые две строки (выделены красным), они и попадают в M:</w:t>
+      </w:r>
+    </w:p>
+    <w:p>
+      <w:pPr>
+        <w:spacing w:after="120"/>
+      </w:pPr>
+    </w:p>
+    <w:p>
+      <w:pPr>
+        <w:keepNext/>
+        <w:jc w:val="center"/>
+      </w:pPr>
+      <w:r>
+        <w:rPr>
+          <w:rFonts w:ascii="Times New Roman" w:cs="Times New Roman" w:eastAsia="Times New Roman" w:hAnsi="Times New Roman"/>
+          <w:b/>
+          <w:bCs/>
+          <w:sz w:val="28"/>
+          <w:szCs w:val="28"/>
+        </w:rPr>
+        <w:t xml:space="preserve">Таблица A</w:t>
+      </w:r>
+    </w:p>
+    <w:tbl>
+      <w:tblPr>
+        <w:tblW w:type="dxa" w:w="6000"/>
+        <w:jc w:val="center"/>
+        <w:tblBorders>
+          <w:top w:val="single" w:color="auto" w:sz="4"/>
+          <w:left w:val="single" w:color="auto" w:sz="4"/>
+          <w:bottom w:val="single" w:color="auto" w:sz="4"/>
+          <w:right w:val="single" w:color="auto" w:sz="4"/>
+          <w:insideH w:val="single" w:color="auto" w:sz="4"/>
+          <w:insideV w:val="single" w:color="auto" w:sz="4"/>
+        </w:tblBorders>
+        <w:tblLayout w:type="fixed"/>
+      </w:tblPr>
+      <w:tblGrid>
+        <w:gridCol w:w="3000"/>
+        <w:gridCol w:w="3000"/>
+      </w:tblGrid>
+      <w:tr>
+        <w:trPr>
+          <w:tblHeader/>
+        </w:trPr>
+        <w:tc>
+          <w:tcPr>
+            <w:tcW w:type="dxa" w:w="3000"/>
+            <w:tcMar>
+              <w:top w:type="dxa" w:w="40"/>
+              <w:left w:type="dxa" w:w="100"/>
+              <w:bottom w:type="dxa" w:w="40"/>
+              <w:right w:type="dxa" w:w="100"/>
+            </w:tcMar>
+            <w:vAlign w:val="center"/>
+          </w:tcPr>
+          <w:p>
+            <w:pPr>
+              <w:keepNext/>
+            </w:pPr>
+            <w:r>
+              <w:rPr>
+                <w:rFonts w:ascii="Times New Roman" w:cs="Times New Roman" w:eastAsia="Times New Roman" w:hAnsi="Times New Roman"/>
+                <w:b/>
+                <w:bCs/>
+                <w:sz w:val="24"/>
+                <w:szCs w:val="24"/>
+              </w:rPr>
+              <w:t xml:space="preserve">Страна (col_1)</w:t>
+            </w:r>
+          </w:p>
+        </w:tc>
+        <w:tc>
+          <w:tcPr>
+            <w:tcW w:type="dxa" w:w="3000"/>
+            <w:tcMar>
+              <w:top w:type="dxa" w:w="40"/>
+              <w:left w:type="dxa" w:w="100"/>
+              <w:bottom w:type="dxa" w:w="40"/>
+              <w:right w:type="dxa" w:w="100"/>
+            </w:tcMar>
+            <w:vAlign w:val="center"/>
+          </w:tcPr>
+          <w:p>
+            <w:pPr>
+              <w:keepNext/>
+            </w:pPr>
+            <w:r>
+              <w:rPr>
+                <w:rFonts w:ascii="Times New Roman" w:cs="Times New Roman" w:eastAsia="Times New Roman" w:hAnsi="Times New Roman"/>
+                <w:b/>
+                <w:bCs/>
+                <w:sz w:val="24"/>
+                <w:szCs w:val="24"/>
+              </w:rPr>
+              <w:t xml:space="preserve">Столица (col_2)</w:t>
+            </w:r>
+          </w:p>
+        </w:tc>
+      </w:tr>
+      <w:tr>
+        <w:trPr>
+          <w:cantSplit/>
+        </w:trPr>
+        <w:tc>
+          <w:tcPr>
+            <w:tcW w:type="dxa" w:w="3000"/>
+            <w:shd w:fill="FFC7CE" w:val="clear"/>
+            <w:tcMar>
+              <w:top w:type="dxa" w:w="40"/>
+              <w:left w:type="dxa" w:w="100"/>
+              <w:bottom w:type="dxa" w:w="40"/>
+              <w:right w:type="dxa" w:w="100"/>
+            </w:tcMar>
+            <w:vAlign w:val="center"/>
+          </w:tcPr>
+          <w:p>
+            <w:pPr>
+              <w:keepNext/>
+            </w:pPr>
+            <w:r>
+              <w:rPr>
+                <w:rFonts w:ascii="Times New Roman" w:cs="Times New Roman" w:eastAsia="Times New Roman" w:hAnsi="Times New Roman"/>
+                <w:b/>
+                <w:bCs/>
+                <w:color w:val="C00000"/>
+                <w:sz w:val="24"/>
+                <w:szCs w:val="24"/>
+              </w:rPr>
+              <w:t xml:space="preserve">Армения</w:t>
+            </w:r>
+          </w:p>
+        </w:tc>
+        <w:tc>
+          <w:tcPr>
+            <w:tcW w:type="dxa" w:w="3000"/>
+            <w:shd w:fill="FFC7CE" w:val="clear"/>
+            <w:tcMar>
+              <w:top w:type="dxa" w:w="40"/>
+              <w:left w:type="dxa" w:w="100"/>
+              <w:bottom w:type="dxa" w:w="40"/>
+              <w:right w:type="dxa" w:w="100"/>
+            </w:tcMar>
+            <w:vAlign w:val="center"/>
+          </w:tcPr>
+          <w:p>
+            <w:pPr>
+              <w:keepNext/>
+            </w:pPr>
+            <w:r>
+              <w:rPr>
+                <w:rFonts w:ascii="Times New Roman" w:cs="Times New Roman" w:eastAsia="Times New Roman" w:hAnsi="Times New Roman"/>
+                <w:b/>
+                <w:bCs/>
+                <w:color w:val="C00000"/>
+                <w:sz w:val="24"/>
+                <w:szCs w:val="24"/>
+              </w:rPr>
+              <w:t xml:space="preserve">Ереван</w:t>
+            </w:r>
+          </w:p>
+        </w:tc>
+      </w:tr>
+      <w:tr>
+        <w:trPr>
+          <w:cantSplit/>
+        </w:trPr>
+        <w:tc>
+          <w:tcPr>
+            <w:tcW w:type="dxa" w:w="3000"/>
+            <w:shd w:fill="FFC7CE" w:val="clear"/>
+            <w:tcMar>
+              <w:top w:type="dxa" w:w="40"/>
+              <w:left w:type="dxa" w:w="100"/>
+              <w:bottom w:type="dxa" w:w="40"/>
+              <w:right w:type="dxa" w:w="100"/>
+            </w:tcMar>
+            <w:vAlign w:val="center"/>
+          </w:tcPr>
+          <w:p>
+            <w:pPr>
+              <w:keepNext/>
+            </w:pPr>
+            <w:r>
+              <w:rPr>
+                <w:rFonts w:ascii="Times New Roman" w:cs="Times New Roman" w:eastAsia="Times New Roman" w:hAnsi="Times New Roman"/>
+                <w:b/>
+                <w:bCs/>
+                <w:color w:val="C00000"/>
+                <w:sz w:val="24"/>
+                <w:szCs w:val="24"/>
+              </w:rPr>
+              <w:t xml:space="preserve">Азербайджан</w:t>
+            </w:r>
+          </w:p>
+        </w:tc>
+        <w:tc>
+          <w:tcPr>
+            <w:tcW w:type="dxa" w:w="3000"/>
+            <w:shd w:fill="FFC7CE" w:val="clear"/>
+            <w:tcMar>
+              <w:top w:type="dxa" w:w="40"/>
+              <w:left w:type="dxa" w:w="100"/>
+              <w:bottom w:type="dxa" w:w="40"/>
+              <w:right w:type="dxa" w:w="100"/>
+            </w:tcMar>
+            <w:vAlign w:val="center"/>
+          </w:tcPr>
+          <w:p>
+            <w:pPr>
+              <w:keepNext/>
+            </w:pPr>
+            <w:r>
+              <w:rPr>
+                <w:rFonts w:ascii="Times New Roman" w:cs="Times New Roman" w:eastAsia="Times New Roman" w:hAnsi="Times New Roman"/>
+                <w:b/>
+                <w:bCs/>
+                <w:color w:val="C00000"/>
+                <w:sz w:val="24"/>
+                <w:szCs w:val="24"/>
+              </w:rPr>
+              <w:t xml:space="preserve">Баку</w:t>
+            </w:r>
+          </w:p>
+        </w:tc>
+      </w:tr>
+      <w:tr>
+        <w:trPr>
+          <w:cantSplit/>
+        </w:trPr>
+        <w:tc>
+          <w:tcPr>
+            <w:tcW w:type="dxa" w:w="3000"/>
+            <w:tcMar>
+              <w:top w:type="dxa" w:w="40"/>
+              <w:left w:type="dxa" w:w="100"/>
+              <w:bottom w:type="dxa" w:w="40"/>
+              <w:right w:type="dxa" w:w="100"/>
+            </w:tcMar>
+            <w:vAlign w:val="center"/>
+          </w:tcPr>
+          <w:p>
+            <w:pPr>
+              <w:keepNext/>
+            </w:pPr>
+            <w:r>
+              <w:rPr>
+                <w:rFonts w:ascii="Times New Roman" w:cs="Times New Roman" w:eastAsia="Times New Roman" w:hAnsi="Times New Roman"/>
+                <w:b w:val="false"/>
+                <w:bCs w:val="false"/>
+                <w:sz w:val="24"/>
+                <w:szCs w:val="24"/>
+              </w:rPr>
+              <w:t xml:space="preserve">Беларусь</w:t>
+            </w:r>
+          </w:p>
+        </w:tc>
+        <w:tc>
+          <w:tcPr>
+            <w:tcW w:type="dxa" w:w="3000"/>
+            <w:tcMar>
+              <w:top w:type="dxa" w:w="40"/>
+              <w:left w:type="dxa" w:w="100"/>
+              <w:bottom w:type="dxa" w:w="40"/>
+              <w:right w:type="dxa" w:w="100"/>
+            </w:tcMar>
+            <w:vAlign w:val="center"/>
+          </w:tcPr>
+          <w:p>
+            <w:pPr>
+              <w:keepNext/>
+            </w:pPr>
+            <w:r>
+              <w:rPr>
+                <w:rFonts w:ascii="Times New Roman" w:cs="Times New Roman" w:eastAsia="Times New Roman" w:hAnsi="Times New Roman"/>
+                <w:b w:val="false"/>
+                <w:bCs w:val="false"/>
+                <w:sz w:val="24"/>
+                <w:szCs w:val="24"/>
+              </w:rPr>
+              <w:t xml:space="preserve">Минск</w:t>
+            </w:r>
+          </w:p>
+        </w:tc>
+      </w:tr>
+      <w:tr>
+        <w:trPr>
+          <w:cantSplit/>
+        </w:trPr>
+        <w:tc>
+          <w:tcPr>
+            <w:tcW w:type="dxa" w:w="3000"/>
+            <w:tcMar>
+              <w:top w:type="dxa" w:w="40"/>
+              <w:left w:type="dxa" w:w="100"/>
+              <w:bottom w:type="dxa" w:w="40"/>
+              <w:right w:type="dxa" w:w="100"/>
+            </w:tcMar>
+            <w:vAlign w:val="center"/>
+          </w:tcPr>
+          <w:p>
+            <w:pPr>
+              <w:keepNext/>
+            </w:pPr>
+            <w:r>
+              <w:rPr>
+                <w:rFonts w:ascii="Times New Roman" w:cs="Times New Roman" w:eastAsia="Times New Roman" w:hAnsi="Times New Roman"/>
+                <w:b w:val="false"/>
+                <w:bCs w:val="false"/>
+                <w:sz w:val="24"/>
+                <w:szCs w:val="24"/>
+              </w:rPr>
+              <w:t xml:space="preserve">Грузия</w:t>
+            </w:r>
+          </w:p>
+        </w:tc>
+        <w:tc>
+          <w:tcPr>
+            <w:tcW w:type="dxa" w:w="3000"/>
+            <w:tcMar>
+              <w:top w:type="dxa" w:w="40"/>
+              <w:left w:type="dxa" w:w="100"/>
+              <w:bottom w:type="dxa" w:w="40"/>
+              <w:right w:type="dxa" w:w="100"/>
+            </w:tcMar>
+            <w:vAlign w:val="center"/>
+          </w:tcPr>
+          <w:p>
+            <w:pPr>
+              <w:keepNext/>
+            </w:pPr>
+            <w:r>
+              <w:rPr>
+                <w:rFonts w:ascii="Times New Roman" w:cs="Times New Roman" w:eastAsia="Times New Roman" w:hAnsi="Times New Roman"/>
+                <w:b w:val="false"/>
+                <w:bCs w:val="false"/>
+                <w:sz w:val="24"/>
+                <w:szCs w:val="24"/>
+              </w:rPr>
+              <w:t xml:space="preserve">Тбилиси</w:t>
+            </w:r>
+          </w:p>
+        </w:tc>
+      </w:tr>
+      <w:tr>
+        <w:trPr>
+          <w:cantSplit/>
+        </w:trPr>
+        <w:tc>
+          <w:tcPr>
+            <w:tcW w:type="dxa" w:w="3000"/>
+            <w:tcMar>
+              <w:top w:type="dxa" w:w="40"/>
+              <w:left w:type="dxa" w:w="100"/>
+              <w:bottom w:type="dxa" w:w="40"/>
+              <w:right w:type="dxa" w:w="100"/>
+            </w:tcMar>
+            <w:vAlign w:val="center"/>
+          </w:tcPr>
+          <w:p>
+            <w:pPr>
+              <w:keepNext/>
+            </w:pPr>
+            <w:r>
+              <w:rPr>
+                <w:rFonts w:ascii="Times New Roman" w:cs="Times New Roman" w:eastAsia="Times New Roman" w:hAnsi="Times New Roman"/>
+                <w:b w:val="false"/>
+                <w:bCs w:val="false"/>
+                <w:sz w:val="24"/>
+                <w:szCs w:val="24"/>
+              </w:rPr>
+              <w:t xml:space="preserve">Казахстан</w:t>
+            </w:r>
+          </w:p>
+        </w:tc>
+        <w:tc>
+          <w:tcPr>
+            <w:tcW w:type="dxa" w:w="3000"/>
+            <w:tcMar>
+              <w:top w:type="dxa" w:w="40"/>
+              <w:left w:type="dxa" w:w="100"/>
+              <w:bottom w:type="dxa" w:w="40"/>
+              <w:right w:type="dxa" w:w="100"/>
+            </w:tcMar>
+            <w:vAlign w:val="center"/>
+          </w:tcPr>
+          <w:p>
+            <w:pPr>
+              <w:keepNext/>
+            </w:pPr>
+            <w:r>
+              <w:rPr>
+                <w:rFonts w:ascii="Times New Roman" w:cs="Times New Roman" w:eastAsia="Times New Roman" w:hAnsi="Times New Roman"/>
+                <w:b w:val="false"/>
+                <w:bCs w:val="false"/>
+                <w:sz w:val="24"/>
+                <w:szCs w:val="24"/>
+              </w:rPr>
+              <w:t xml:space="preserve">Астана</w:t>
+            </w:r>
+          </w:p>
+        </w:tc>
+      </w:tr>
+      <w:tr>
+        <w:trPr>
+          <w:cantSplit/>
+        </w:trPr>
+        <w:tc>
+          <w:tcPr>
+            <w:tcW w:type="dxa" w:w="3000"/>
+            <w:tcMar>
+              <w:top w:type="dxa" w:w="40"/>
+              <w:left w:type="dxa" w:w="100"/>
+              <w:bottom w:type="dxa" w:w="40"/>
+              <w:right w:type="dxa" w:w="100"/>
+            </w:tcMar>
+            <w:vAlign w:val="center"/>
+          </w:tcPr>
+          <w:p>
+            <w:pPr>
+              <w:keepNext/>
+            </w:pPr>
+            <w:r>
+              <w:rPr>
+                <w:rFonts w:ascii="Times New Roman" w:cs="Times New Roman" w:eastAsia="Times New Roman" w:hAnsi="Times New Roman"/>
+                <w:b w:val="false"/>
+                <w:bCs w:val="false"/>
+                <w:sz w:val="24"/>
+                <w:szCs w:val="24"/>
+              </w:rPr>
+              <w:t xml:space="preserve">Кыргызстан</w:t>
+            </w:r>
+          </w:p>
+        </w:tc>
+        <w:tc>
+          <w:tcPr>
+            <w:tcW w:type="dxa" w:w="3000"/>
+            <w:tcMar>
+              <w:top w:type="dxa" w:w="40"/>
+              <w:left w:type="dxa" w:w="100"/>
+              <w:bottom w:type="dxa" w:w="40"/>
+              <w:right w:type="dxa" w:w="100"/>
+            </w:tcMar>
+            <w:vAlign w:val="center"/>
+          </w:tcPr>
+          <w:p>
+            <w:pPr>
+              <w:keepNext/>
+            </w:pPr>
+            <w:r>
+              <w:rPr>
+                <w:rFonts w:ascii="Times New Roman" w:cs="Times New Roman" w:eastAsia="Times New Roman" w:hAnsi="Times New Roman"/>
+                <w:b w:val="false"/>
+                <w:bCs w:val="false"/>
+                <w:sz w:val="24"/>
+                <w:szCs w:val="24"/>
+              </w:rPr>
+              <w:t xml:space="preserve">Бишкек</w:t>
+            </w:r>
+          </w:p>
+        </w:tc>
+      </w:tr>
+    </w:tbl>
+    <w:p>
+      <w:pPr>
+        <w:spacing w:after="120"/>
+      </w:pPr>
+    </w:p>
+    <w:p>
+      <w:pPr>
+        <w:spacing w:after="0" w:before="0" w:line="360"/>
+        <w:ind w:firstLine="709"/>
+        <w:jc w:val="both"/>
+      </w:pPr>
+      <w:r>
+        <w:rPr>
+          <w:rFonts w:ascii="Times New Roman" w:cs="Times New Roman" w:eastAsia="Times New Roman" w:hAnsi="Times New Roman"/>
+          <w:sz w:val="28"/>
+          <w:szCs w:val="28"/>
+        </w:rPr>
         <w:t xml:space="preserve">Результат M: </w:t>
       </w:r>
       <w:r>
@@ -1039,8 +1520,710 @@
           <w:sz w:val="28"/>
           <w:szCs w:val="28"/>
         </w:rPr>
-        <w:t xml:space="preserve">То же самое, только берем таблицу B и ее последние две строки.</w:t>
-      </w:r>
+        <w:t xml:space="preserve">То же самое, только берем таблицу B и условно отмечаем ее последние две строки (выделены красным), они попадают в N:</w:t>
+      </w:r>
+    </w:p>
+    <w:p>
+      <w:pPr>
+        <w:spacing w:after="120"/>
+      </w:pPr>
+    </w:p>
+    <w:p>
+      <w:pPr>
+        <w:keepNext/>
+        <w:jc w:val="center"/>
+      </w:pPr>
+      <w:r>
+        <w:rPr>
+          <w:rFonts w:ascii="Times New Roman" w:cs="Times New Roman" w:eastAsia="Times New Roman" w:hAnsi="Times New Roman"/>
+          <w:b/>
+          <w:bCs/>
+          <w:sz w:val="28"/>
+          <w:szCs w:val="28"/>
+        </w:rPr>
+        <w:t xml:space="preserve">Таблица B</w:t>
+      </w:r>
+    </w:p>
+    <w:tbl>
+      <w:tblPr>
+        <w:tblW w:type="dxa" w:w="6000"/>
+        <w:jc w:val="center"/>
+        <w:tblBorders>
+          <w:top w:val="single" w:color="auto" w:sz="4"/>
+          <w:left w:val="single" w:color="auto" w:sz="4"/>
+          <w:bottom w:val="single" w:color="auto" w:sz="4"/>
+          <w:right w:val="single" w:color="auto" w:sz="4"/>
+          <w:insideH w:val="single" w:color="auto" w:sz="4"/>
+          <w:insideV w:val="single" w:color="auto" w:sz="4"/>
+        </w:tblBorders>
+        <w:tblLayout w:type="fixed"/>
+      </w:tblPr>
+      <w:tblGrid>
+        <w:gridCol w:w="3000"/>
+        <w:gridCol w:w="3000"/>
+      </w:tblGrid>
+      <w:tr>
+        <w:trPr>
+          <w:tblHeader/>
+        </w:trPr>
+        <w:tc>
+          <w:tcPr>
+            <w:tcW w:type="dxa" w:w="3000"/>
+            <w:tcMar>
+              <w:top w:type="dxa" w:w="40"/>
+              <w:left w:type="dxa" w:w="100"/>
+              <w:bottom w:type="dxa" w:w="40"/>
+              <w:right w:type="dxa" w:w="100"/>
+            </w:tcMar>
+            <w:vAlign w:val="center"/>
+          </w:tcPr>
+          <w:p>
+            <w:pPr>
+              <w:keepNext/>
+            </w:pPr>
+            <w:r>
+              <w:rPr>
+                <w:rFonts w:ascii="Times New Roman" w:cs="Times New Roman" w:eastAsia="Times New Roman" w:hAnsi="Times New Roman"/>
+                <w:b/>
+                <w:bCs/>
+                <w:sz w:val="24"/>
+                <w:szCs w:val="24"/>
+              </w:rPr>
+              <w:t xml:space="preserve">Страна (col_1)</w:t>
+            </w:r>
+          </w:p>
+        </w:tc>
+        <w:tc>
+          <w:tcPr>
+            <w:tcW w:type="dxa" w:w="3000"/>
+            <w:tcMar>
+              <w:top w:type="dxa" w:w="40"/>
+              <w:left w:type="dxa" w:w="100"/>
+              <w:bottom w:type="dxa" w:w="40"/>
+              <w:right w:type="dxa" w:w="100"/>
+            </w:tcMar>
+            <w:vAlign w:val="center"/>
+          </w:tcPr>
+          <w:p>
+            <w:pPr>
+              <w:keepNext/>
+            </w:pPr>
+            <w:r>
+              <w:rPr>
+                <w:rFonts w:ascii="Times New Roman" w:cs="Times New Roman" w:eastAsia="Times New Roman" w:hAnsi="Times New Roman"/>
+                <w:b/>
+                <w:bCs/>
+                <w:sz w:val="24"/>
+                <w:szCs w:val="24"/>
+              </w:rPr>
+              <w:t xml:space="preserve">Столица (col_2)</w:t>
+            </w:r>
+          </w:p>
+        </w:tc>
+      </w:tr>
+      <w:tr>
+        <w:trPr>
+          <w:cantSplit/>
+        </w:trPr>
+        <w:tc>
+          <w:tcPr>
+            <w:tcW w:type="dxa" w:w="3000"/>
+            <w:tcMar>
+              <w:top w:type="dxa" w:w="40"/>
+              <w:left w:type="dxa" w:w="100"/>
+              <w:bottom w:type="dxa" w:w="40"/>
+              <w:right w:type="dxa" w:w="100"/>
+            </w:tcMar>
+            <w:vAlign w:val="center"/>
+          </w:tcPr>
+          <w:p>
+            <w:pPr>
+              <w:keepNext/>
+            </w:pPr>
+            <w:r>
+              <w:rPr>
+                <w:rFonts w:ascii="Times New Roman" w:cs="Times New Roman" w:eastAsia="Times New Roman" w:hAnsi="Times New Roman"/>
+                <w:b w:val="false"/>
+                <w:bCs w:val="false"/>
+                <w:sz w:val="24"/>
+                <w:szCs w:val="24"/>
+              </w:rPr>
+              <w:t xml:space="preserve">Грузия</w:t>
+            </w:r>
+          </w:p>
+        </w:tc>
+        <w:tc>
+          <w:tcPr>
+            <w:tcW w:type="dxa" w:w="3000"/>
+            <w:tcMar>
+              <w:top w:type="dxa" w:w="40"/>
+              <w:left w:type="dxa" w:w="100"/>
+              <w:bottom w:type="dxa" w:w="40"/>
+              <w:right w:type="dxa" w:w="100"/>
+            </w:tcMar>
+            <w:vAlign w:val="center"/>
+          </w:tcPr>
+          <w:p>
+            <w:pPr>
+              <w:keepNext/>
+            </w:pPr>
+            <w:r>
+              <w:rPr>
+                <w:rFonts w:ascii="Times New Roman" w:cs="Times New Roman" w:eastAsia="Times New Roman" w:hAnsi="Times New Roman"/>
+                <w:b w:val="false"/>
+                <w:bCs w:val="false"/>
+                <w:sz w:val="24"/>
+                <w:szCs w:val="24"/>
+              </w:rPr>
+              <w:t xml:space="preserve">Тбилиси</w:t>
+            </w:r>
+          </w:p>
+        </w:tc>
+      </w:tr>
+      <w:tr>
+        <w:trPr>
+          <w:cantSplit/>
+        </w:trPr>
+        <w:tc>
+          <w:tcPr>
+            <w:tcW w:type="dxa" w:w="3000"/>
+            <w:tcMar>
+              <w:top w:type="dxa" w:w="40"/>
+              <w:left w:type="dxa" w:w="100"/>
+              <w:bottom w:type="dxa" w:w="40"/>
+              <w:right w:type="dxa" w:w="100"/>
+            </w:tcMar>
+            <w:vAlign w:val="center"/>
+          </w:tcPr>
+          <w:p>
+            <w:pPr>
+              <w:keepNext/>
+            </w:pPr>
+            <w:r>
+              <w:rPr>
+                <w:rFonts w:ascii="Times New Roman" w:cs="Times New Roman" w:eastAsia="Times New Roman" w:hAnsi="Times New Roman"/>
+                <w:b w:val="false"/>
+                <w:bCs w:val="false"/>
+                <w:sz w:val="24"/>
+                <w:szCs w:val="24"/>
+              </w:rPr>
+              <w:t xml:space="preserve">Казахстан</w:t>
+            </w:r>
+          </w:p>
+        </w:tc>
+        <w:tc>
+          <w:tcPr>
+            <w:tcW w:type="dxa" w:w="3000"/>
+            <w:tcMar>
+              <w:top w:type="dxa" w:w="40"/>
+              <w:left w:type="dxa" w:w="100"/>
+              <w:bottom w:type="dxa" w:w="40"/>
+              <w:right w:type="dxa" w:w="100"/>
+            </w:tcMar>
+            <w:vAlign w:val="center"/>
+          </w:tcPr>
+          <w:p>
+            <w:pPr>
+              <w:keepNext/>
+            </w:pPr>
+            <w:r>
+              <w:rPr>
+                <w:rFonts w:ascii="Times New Roman" w:cs="Times New Roman" w:eastAsia="Times New Roman" w:hAnsi="Times New Roman"/>
+                <w:b w:val="false"/>
+                <w:bCs w:val="false"/>
+                <w:sz w:val="24"/>
+                <w:szCs w:val="24"/>
+              </w:rPr>
+              <w:t xml:space="preserve">Астана</w:t>
+            </w:r>
+          </w:p>
+        </w:tc>
+      </w:tr>
+      <w:tr>
+        <w:trPr>
+          <w:cantSplit/>
+        </w:trPr>
+        <w:tc>
+          <w:tcPr>
+            <w:tcW w:type="dxa" w:w="3000"/>
+            <w:tcMar>
+              <w:top w:type="dxa" w:w="40"/>
+              <w:left w:type="dxa" w:w="100"/>
+              <w:bottom w:type="dxa" w:w="40"/>
+              <w:right w:type="dxa" w:w="100"/>
+            </w:tcMar>
+            <w:vAlign w:val="center"/>
+          </w:tcPr>
+          <w:p>
+            <w:pPr>
+              <w:keepNext/>
+            </w:pPr>
+            <w:r>
+              <w:rPr>
+                <w:rFonts w:ascii="Times New Roman" w:cs="Times New Roman" w:eastAsia="Times New Roman" w:hAnsi="Times New Roman"/>
+                <w:b w:val="false"/>
+                <w:bCs w:val="false"/>
+                <w:sz w:val="24"/>
+                <w:szCs w:val="24"/>
+              </w:rPr>
+              <w:t xml:space="preserve">Кыргызстан</w:t>
+            </w:r>
+          </w:p>
+        </w:tc>
+        <w:tc>
+          <w:tcPr>
+            <w:tcW w:type="dxa" w:w="3000"/>
+            <w:tcMar>
+              <w:top w:type="dxa" w:w="40"/>
+              <w:left w:type="dxa" w:w="100"/>
+              <w:bottom w:type="dxa" w:w="40"/>
+              <w:right w:type="dxa" w:w="100"/>
+            </w:tcMar>
+            <w:vAlign w:val="center"/>
+          </w:tcPr>
+          <w:p>
+            <w:pPr>
+              <w:keepNext/>
+            </w:pPr>
+            <w:r>
+              <w:rPr>
+                <w:rFonts w:ascii="Times New Roman" w:cs="Times New Roman" w:eastAsia="Times New Roman" w:hAnsi="Times New Roman"/>
+                <w:b w:val="false"/>
+                <w:bCs w:val="false"/>
+                <w:sz w:val="24"/>
+                <w:szCs w:val="24"/>
+              </w:rPr>
+              <w:t xml:space="preserve">Бишкек</w:t>
+            </w:r>
+          </w:p>
+        </w:tc>
+      </w:tr>
+      <w:tr>
+        <w:trPr>
+          <w:cantSplit/>
+        </w:trPr>
+        <w:tc>
+          <w:tcPr>
+            <w:tcW w:type="dxa" w:w="3000"/>
+            <w:tcMar>
+              <w:top w:type="dxa" w:w="40"/>
+              <w:left w:type="dxa" w:w="100"/>
+              <w:bottom w:type="dxa" w:w="40"/>
+              <w:right w:type="dxa" w:w="100"/>
+            </w:tcMar>
+            <w:vAlign w:val="center"/>
+          </w:tcPr>
+          <w:p>
+            <w:pPr>
+              <w:keepNext/>
+            </w:pPr>
+            <w:r>
+              <w:rPr>
+                <w:rFonts w:ascii="Times New Roman" w:cs="Times New Roman" w:eastAsia="Times New Roman" w:hAnsi="Times New Roman"/>
+                <w:b w:val="false"/>
+                <w:bCs w:val="false"/>
+                <w:sz w:val="24"/>
+                <w:szCs w:val="24"/>
+              </w:rPr>
+              <w:t xml:space="preserve">Латвия</w:t>
+            </w:r>
+          </w:p>
+        </w:tc>
+        <w:tc>
+          <w:tcPr>
+            <w:tcW w:type="dxa" w:w="3000"/>
+            <w:tcMar>
+              <w:top w:type="dxa" w:w="40"/>
+              <w:left w:type="dxa" w:w="100"/>
+              <w:bottom w:type="dxa" w:w="40"/>
+              <w:right w:type="dxa" w:w="100"/>
+            </w:tcMar>
+            <w:vAlign w:val="center"/>
+          </w:tcPr>
+          <w:p>
+            <w:pPr>
+              <w:keepNext/>
+            </w:pPr>
+            <w:r>
+              <w:rPr>
+                <w:rFonts w:ascii="Times New Roman" w:cs="Times New Roman" w:eastAsia="Times New Roman" w:hAnsi="Times New Roman"/>
+                <w:b w:val="false"/>
+                <w:bCs w:val="false"/>
+                <w:sz w:val="24"/>
+                <w:szCs w:val="24"/>
+              </w:rPr>
+              <w:t xml:space="preserve">Рига</w:t>
+            </w:r>
+          </w:p>
+        </w:tc>
+      </w:tr>
+      <w:tr>
+        <w:trPr>
+          <w:cantSplit/>
+        </w:trPr>
+        <w:tc>
+          <w:tcPr>
+            <w:tcW w:type="dxa" w:w="3000"/>
+            <w:tcMar>
+              <w:top w:type="dxa" w:w="40"/>
+              <w:left w:type="dxa" w:w="100"/>
+              <w:bottom w:type="dxa" w:w="40"/>
+              <w:right w:type="dxa" w:w="100"/>
+            </w:tcMar>
+            <w:vAlign w:val="center"/>
+          </w:tcPr>
+          <w:p>
+            <w:pPr>
+              <w:keepNext/>
+            </w:pPr>
+            <w:r>
+              <w:rPr>
+                <w:rFonts w:ascii="Times New Roman" w:cs="Times New Roman" w:eastAsia="Times New Roman" w:hAnsi="Times New Roman"/>
+                <w:b w:val="false"/>
+                <w:bCs w:val="false"/>
+                <w:sz w:val="24"/>
+                <w:szCs w:val="24"/>
+              </w:rPr>
+              <w:t xml:space="preserve">Литва</w:t>
+            </w:r>
+          </w:p>
+        </w:tc>
+        <w:tc>
+          <w:tcPr>
+            <w:tcW w:type="dxa" w:w="3000"/>
+            <w:tcMar>
+              <w:top w:type="dxa" w:w="40"/>
+              <w:left w:type="dxa" w:w="100"/>
+              <w:bottom w:type="dxa" w:w="40"/>
+              <w:right w:type="dxa" w:w="100"/>
+            </w:tcMar>
+            <w:vAlign w:val="center"/>
+          </w:tcPr>
+          <w:p>
+            <w:pPr>
+              <w:keepNext/>
+            </w:pPr>
+            <w:r>
+              <w:rPr>
+                <w:rFonts w:ascii="Times New Roman" w:cs="Times New Roman" w:eastAsia="Times New Roman" w:hAnsi="Times New Roman"/>
+                <w:b w:val="false"/>
+                <w:bCs w:val="false"/>
+                <w:sz w:val="24"/>
+                <w:szCs w:val="24"/>
+              </w:rPr>
+              <w:t xml:space="preserve">Вильнюс</w:t>
+            </w:r>
+          </w:p>
+        </w:tc>
+      </w:tr>
+      <w:tr>
+        <w:trPr>
+          <w:cantSplit/>
+        </w:trPr>
+        <w:tc>
+          <w:tcPr>
+            <w:tcW w:type="dxa" w:w="3000"/>
+            <w:tcMar>
+              <w:top w:type="dxa" w:w="40"/>
+              <w:left w:type="dxa" w:w="100"/>
+              <w:bottom w:type="dxa" w:w="40"/>
+              <w:right w:type="dxa" w:w="100"/>
+            </w:tcMar>
+            <w:vAlign w:val="center"/>
+          </w:tcPr>
+          <w:p>
+            <w:pPr>
+              <w:keepNext/>
+            </w:pPr>
+            <w:r>
+              <w:rPr>
+                <w:rFonts w:ascii="Times New Roman" w:cs="Times New Roman" w:eastAsia="Times New Roman" w:hAnsi="Times New Roman"/>
+                <w:b w:val="false"/>
+                <w:bCs w:val="false"/>
+                <w:sz w:val="24"/>
+                <w:szCs w:val="24"/>
+              </w:rPr>
+              <w:t xml:space="preserve">Молдова</w:t>
+            </w:r>
+          </w:p>
+        </w:tc>
+        <w:tc>
+          <w:tcPr>
+            <w:tcW w:type="dxa" w:w="3000"/>
+            <w:tcMar>
+              <w:top w:type="dxa" w:w="40"/>
+              <w:left w:type="dxa" w:w="100"/>
+              <w:bottom w:type="dxa" w:w="40"/>
+              <w:right w:type="dxa" w:w="100"/>
+            </w:tcMar>
+            <w:vAlign w:val="center"/>
+          </w:tcPr>
+          <w:p>
+            <w:pPr>
+              <w:keepNext/>
+            </w:pPr>
+            <w:r>
+              <w:rPr>
+                <w:rFonts w:ascii="Times New Roman" w:cs="Times New Roman" w:eastAsia="Times New Roman" w:hAnsi="Times New Roman"/>
+                <w:b w:val="false"/>
+                <w:bCs w:val="false"/>
+                <w:sz w:val="24"/>
+                <w:szCs w:val="24"/>
+              </w:rPr>
+              <w:t xml:space="preserve">Кишинев</w:t>
+            </w:r>
+          </w:p>
+        </w:tc>
+      </w:tr>
+      <w:tr>
+        <w:trPr>
+          <w:cantSplit/>
+        </w:trPr>
+        <w:tc>
+          <w:tcPr>
+            <w:tcW w:type="dxa" w:w="3000"/>
+            <w:tcMar>
+              <w:top w:type="dxa" w:w="40"/>
+              <w:left w:type="dxa" w:w="100"/>
+              <w:bottom w:type="dxa" w:w="40"/>
+              <w:right w:type="dxa" w:w="100"/>
+            </w:tcMar>
+            <w:vAlign w:val="center"/>
+          </w:tcPr>
+          <w:p>
+            <w:pPr>
+              <w:keepNext/>
+            </w:pPr>
+            <w:r>
+              <w:rPr>
+                <w:rFonts w:ascii="Times New Roman" w:cs="Times New Roman" w:eastAsia="Times New Roman" w:hAnsi="Times New Roman"/>
+                <w:b w:val="false"/>
+                <w:bCs w:val="false"/>
+                <w:sz w:val="24"/>
+                <w:szCs w:val="24"/>
+              </w:rPr>
+              <w:t xml:space="preserve">Россия</w:t>
+            </w:r>
+          </w:p>
+        </w:tc>
+        <w:tc>
+          <w:tcPr>
+            <w:tcW w:type="dxa" w:w="3000"/>
+            <w:tcMar>
+              <w:top w:type="dxa" w:w="40"/>
+              <w:left w:type="dxa" w:w="100"/>
+              <w:bottom w:type="dxa" w:w="40"/>
+              <w:right w:type="dxa" w:w="100"/>
+            </w:tcMar>
+            <w:vAlign w:val="center"/>
+          </w:tcPr>
+          <w:p>
+            <w:pPr>
+              <w:keepNext/>
+            </w:pPr>
+            <w:r>
+              <w:rPr>
+                <w:rFonts w:ascii="Times New Roman" w:cs="Times New Roman" w:eastAsia="Times New Roman" w:hAnsi="Times New Roman"/>
+                <w:b w:val="false"/>
+                <w:bCs w:val="false"/>
+                <w:sz w:val="24"/>
+                <w:szCs w:val="24"/>
+              </w:rPr>
+              <w:t xml:space="preserve">Москва</w:t>
+            </w:r>
+          </w:p>
+        </w:tc>
+      </w:tr>
+      <w:tr>
+        <w:trPr>
+          <w:cantSplit/>
+        </w:trPr>
+        <w:tc>
+          <w:tcPr>
+            <w:tcW w:type="dxa" w:w="3000"/>
+            <w:tcMar>
+              <w:top w:type="dxa" w:w="40"/>
+              <w:left w:type="dxa" w:w="100"/>
+              <w:bottom w:type="dxa" w:w="40"/>
+              <w:right w:type="dxa" w:w="100"/>
+            </w:tcMar>
+            <w:vAlign w:val="center"/>
+          </w:tcPr>
+          <w:p>
+            <w:pPr>
+              <w:keepNext/>
+            </w:pPr>
+            <w:r>
+              <w:rPr>
+                <w:rFonts w:ascii="Times New Roman" w:cs="Times New Roman" w:eastAsia="Times New Roman" w:hAnsi="Times New Roman"/>
+                <w:b w:val="false"/>
+                <w:bCs w:val="false"/>
+                <w:sz w:val="24"/>
+                <w:szCs w:val="24"/>
+              </w:rPr>
+              <w:t xml:space="preserve">Таджикистан</w:t>
+            </w:r>
+          </w:p>
+        </w:tc>
+        <w:tc>
+          <w:tcPr>
+            <w:tcW w:type="dxa" w:w="3000"/>
+            <w:tcMar>
+              <w:top w:type="dxa" w:w="40"/>
+              <w:left w:type="dxa" w:w="100"/>
+              <w:bottom w:type="dxa" w:w="40"/>
+              <w:right w:type="dxa" w:w="100"/>
+            </w:tcMar>
+            <w:vAlign w:val="center"/>
+          </w:tcPr>
+          <w:p>
+            <w:pPr>
+              <w:keepNext/>
+            </w:pPr>
+            <w:r>
+              <w:rPr>
+                <w:rFonts w:ascii="Times New Roman" w:cs="Times New Roman" w:eastAsia="Times New Roman" w:hAnsi="Times New Roman"/>
+                <w:b w:val="false"/>
+                <w:bCs w:val="false"/>
+                <w:sz w:val="24"/>
+                <w:szCs w:val="24"/>
+              </w:rPr>
+              <w:t xml:space="preserve">Душанбе</w:t>
+            </w:r>
+          </w:p>
+        </w:tc>
+      </w:tr>
+      <w:tr>
+        <w:trPr>
+          <w:cantSplit/>
+        </w:trPr>
+        <w:tc>
+          <w:tcPr>
+            <w:tcW w:type="dxa" w:w="3000"/>
+            <w:shd w:fill="FFC7CE" w:val="clear"/>
+            <w:tcMar>
+              <w:top w:type="dxa" w:w="40"/>
+              <w:left w:type="dxa" w:w="100"/>
+              <w:bottom w:type="dxa" w:w="40"/>
+              <w:right w:type="dxa" w:w="100"/>
+            </w:tcMar>
+            <w:vAlign w:val="center"/>
+          </w:tcPr>
+          <w:p>
+            <w:pPr>
+              <w:keepNext/>
+            </w:pPr>
+            <w:r>
+              <w:rPr>
+                <w:rFonts w:ascii="Times New Roman" w:cs="Times New Roman" w:eastAsia="Times New Roman" w:hAnsi="Times New Roman"/>
+                <w:b/>
+                <w:bCs/>
+                <w:color w:val="C00000"/>
+                <w:sz w:val="24"/>
+                <w:szCs w:val="24"/>
+              </w:rPr>
+              <w:t xml:space="preserve">Туркменистан</w:t>
+            </w:r>
+          </w:p>
+        </w:tc>
+        <w:tc>
+          <w:tcPr>
+            <w:tcW w:type="dxa" w:w="3000"/>
+            <w:shd w:fill="FFC7CE" w:val="clear"/>
+            <w:tcMar>
+              <w:top w:type="dxa" w:w="40"/>
+              <w:left w:type="dxa" w:w="100"/>
+              <w:bottom w:type="dxa" w:w="40"/>
+              <w:right w:type="dxa" w:w="100"/>
+            </w:tcMar>
+            <w:vAlign w:val="center"/>
+          </w:tcPr>
+          <w:p>
+            <w:pPr>
+              <w:keepNext/>
+            </w:pPr>
+            <w:r>
+              <w:rPr>
+                <w:rFonts w:ascii="Times New Roman" w:cs="Times New Roman" w:eastAsia="Times New Roman" w:hAnsi="Times New Roman"/>
+                <w:b/>
+                <w:bCs/>
+                <w:color w:val="C00000"/>
+                <w:sz w:val="24"/>
+                <w:szCs w:val="24"/>
+              </w:rPr>
+              <w:t xml:space="preserve">Ашхабад</w:t>
+            </w:r>
+          </w:p>
+        </w:tc>
+      </w:tr>
+      <w:tr>
+        <w:trPr>
+          <w:cantSplit/>
+        </w:trPr>
+        <w:tc>
+          <w:tcPr>
+            <w:tcW w:type="dxa" w:w="3000"/>
+            <w:shd w:fill="FFC7CE" w:val="clear"/>
+            <w:tcMar>
+              <w:top w:type="dxa" w:w="40"/>
+              <w:left w:type="dxa" w:w="100"/>
+              <w:bottom w:type="dxa" w:w="40"/>
+              <w:right w:type="dxa" w:w="100"/>
+            </w:tcMar>
+            <w:vAlign w:val="center"/>
+          </w:tcPr>
+          <w:p>
+            <w:pPr>
+              <w:keepNext/>
+            </w:pPr>
+            <w:r>
+              <w:rPr>
+                <w:rFonts w:ascii="Times New Roman" w:cs="Times New Roman" w:eastAsia="Times New Roman" w:hAnsi="Times New Roman"/>
+                <w:b/>
+                <w:bCs/>
+                <w:color w:val="C00000"/>
+                <w:sz w:val="24"/>
+                <w:szCs w:val="24"/>
+              </w:rPr>
+              <w:t xml:space="preserve">Узбекистан</w:t>
+            </w:r>
+          </w:p>
+        </w:tc>
+        <w:tc>
+          <w:tcPr>
+            <w:tcW w:type="dxa" w:w="3000"/>
+            <w:shd w:fill="FFC7CE" w:val="clear"/>
+            <w:tcMar>
+              <w:top w:type="dxa" w:w="40"/>
+              <w:left w:type="dxa" w:w="100"/>
+              <w:bottom w:type="dxa" w:w="40"/>
+              <w:right w:type="dxa" w:w="100"/>
+            </w:tcMar>
+            <w:vAlign w:val="center"/>
+          </w:tcPr>
+          <w:p>
+            <w:pPr>
+              <w:keepNext/>
+            </w:pPr>
+            <w:r>
+              <w:rPr>
+                <w:rFonts w:ascii="Times New Roman" w:cs="Times New Roman" w:eastAsia="Times New Roman" w:hAnsi="Times New Roman"/>
+                <w:b/>
+                <w:bCs/>
+                <w:color w:val="C00000"/>
+                <w:sz w:val="24"/>
+                <w:szCs w:val="24"/>
+              </w:rPr>
+              <w:t xml:space="preserve">Ташкент</w:t>
+            </w:r>
+          </w:p>
+        </w:tc>
+      </w:tr>
+    </w:tbl>
+    <w:p>
+      <w:pPr>
+        <w:spacing w:after="120"/>
+      </w:pPr>
     </w:p>
     <w:p>
       <w:pPr>

</xml_diff>

<commit_message>
Replace intro and cheat sheet in task 1 explanation with lab header, goal and conclusion
Co-Authored-By: Claude Opus 5.5 <noreply@anthropic.com>
Claude-Session: https://claude.ai/code/session_01M8pUE3adzgGc2WqjPvNRzN
</commit_message>
<xml_diff>
--- a/Lab1/zadanie1_razbor.docx
+++ b/Lab1/zadanie1_razbor.docx
@@ -4,7 +4,7 @@
   <w:body>
     <w:p>
       <w:pPr>
-        <w:spacing w:after="240"/>
+        <w:spacing w:after="240" w:line="360"/>
         <w:jc w:val="center"/>
       </w:pPr>
       <w:r>
@@ -12,10 +12,10 @@
           <w:rFonts w:ascii="Times New Roman" w:cs="Times New Roman" w:eastAsia="Times New Roman" w:hAnsi="Times New Roman"/>
           <w:b/>
           <w:bCs/>
-          <w:sz w:val="32"/>
-          <w:szCs w:val="32"/>
-        </w:rPr>
-        <w:t xml:space="preserve">Разбор задания 1 (вариант 1)</w:t>
+          <w:sz w:val="28"/>
+          <w:szCs w:val="28"/>
+        </w:rPr>
+        <w:t xml:space="preserve">ЛАБОРАТОРНАЯ РАБОТА №1 ИЗУЧЕНИЕ ПРИНЦИПОВ РАБОТЫ РЕЛЯЦИОННОЙ БАЗЫ ДАННЫХ</w:t>
       </w:r>
     </w:p>
     <w:p>
@@ -27,28 +27,20 @@
       <w:r>
         <w:rPr>
           <w:rFonts w:ascii="Times New Roman" w:cs="Times New Roman" w:eastAsia="Times New Roman" w:hAnsi="Times New Roman"/>
-          <w:sz w:val="28"/>
-          <w:szCs w:val="28"/>
-        </w:rPr>
-        <w:t xml:space="preserve">Сначала о том, что вообще происходит. Таблицы здесь рассматриваются как </w:t>
-      </w:r>
-      <w:r>
-        <w:rPr>
-          <w:rFonts w:ascii="Times New Roman" w:cs="Times New Roman" w:eastAsia="Times New Roman" w:hAnsi="Times New Roman"/>
           <w:b/>
           <w:bCs/>
           <w:sz w:val="28"/>
           <w:szCs w:val="28"/>
         </w:rPr>
-        <w:t xml:space="preserve">множества строк</w:t>
-      </w:r>
-      <w:r>
-        <w:rPr>
-          <w:rFonts w:ascii="Times New Roman" w:cs="Times New Roman" w:eastAsia="Times New Roman" w:hAnsi="Times New Roman"/>
-          <w:sz w:val="28"/>
-          <w:szCs w:val="28"/>
-        </w:rPr>
-        <w:t xml:space="preserve">. Каждая строка это пара «страна, столица». col_1 означает первый столбец (Страна), col_2 означает второй столбец (Столица).</w:t>
+        <w:t xml:space="preserve">Цель работы:</w:t>
+      </w:r>
+      <w:r>
+        <w:rPr>
+          <w:rFonts w:ascii="Times New Roman" w:cs="Times New Roman" w:eastAsia="Times New Roman" w:hAnsi="Times New Roman"/>
+          <w:sz w:val="28"/>
+          <w:szCs w:val="28"/>
+        </w:rPr>
+        <w:t xml:space="preserve"> познакомиться с основными понятиями реляционных баз данных и принципами работы с ними, получить представление об отношении и его составляющих, научиться описывать объекты реального мира с помощью отношений. Также разобраться в понятии ключа и его видах и применить полученные знания на практике.</w:t>
       </w:r>
     </w:p>
     <w:p>
@@ -3300,549 +3292,8 @@
           <w:sz w:val="30"/>
           <w:szCs w:val="30"/>
         </w:rPr>
-        <w:t xml:space="preserve">Шпаргалка по значкам</w:t>
-      </w:r>
-    </w:p>
-    <w:tbl>
-      <w:tblPr>
-        <w:tblW w:type="dxa" w:w="9400"/>
-        <w:jc w:val="center"/>
-        <w:tblBorders>
-          <w:top w:val="single" w:color="auto" w:sz="4"/>
-          <w:left w:val="single" w:color="auto" w:sz="4"/>
-          <w:bottom w:val="single" w:color="auto" w:sz="4"/>
-          <w:right w:val="single" w:color="auto" w:sz="4"/>
-          <w:insideH w:val="single" w:color="auto" w:sz="4"/>
-          <w:insideV w:val="single" w:color="auto" w:sz="4"/>
-        </w:tblBorders>
-        <w:tblLayout w:type="fixed"/>
-      </w:tblPr>
-      <w:tblGrid>
-        <w:gridCol w:w="1500"/>
-        <w:gridCol w:w="2900"/>
-        <w:gridCol w:w="5000"/>
-      </w:tblGrid>
-      <w:tr>
-        <w:trPr>
-          <w:tblHeader/>
-        </w:trPr>
-        <w:tc>
-          <w:tcPr>
-            <w:tcW w:type="dxa" w:w="1500"/>
-            <w:tcMar>
-              <w:top w:type="dxa" w:w="40"/>
-              <w:left w:type="dxa" w:w="100"/>
-              <w:bottom w:type="dxa" w:w="40"/>
-              <w:right w:type="dxa" w:w="100"/>
-            </w:tcMar>
-            <w:vAlign w:val="center"/>
-          </w:tcPr>
-          <w:p>
-            <w:pPr>
-              <w:keepNext/>
-            </w:pPr>
-            <w:r>
-              <w:rPr>
-                <w:rFonts w:ascii="Times New Roman" w:cs="Times New Roman" w:eastAsia="Times New Roman" w:hAnsi="Times New Roman"/>
-                <w:b/>
-                <w:bCs/>
-                <w:sz w:val="24"/>
-                <w:szCs w:val="24"/>
-              </w:rPr>
-              <w:t xml:space="preserve">Значок</w:t>
-            </w:r>
-          </w:p>
-        </w:tc>
-        <w:tc>
-          <w:tcPr>
-            <w:tcW w:type="dxa" w:w="2900"/>
-            <w:tcMar>
-              <w:top w:type="dxa" w:w="40"/>
-              <w:left w:type="dxa" w:w="100"/>
-              <w:bottom w:type="dxa" w:w="40"/>
-              <w:right w:type="dxa" w:w="100"/>
-            </w:tcMar>
-            <w:vAlign w:val="center"/>
-          </w:tcPr>
-          <w:p>
-            <w:pPr>
-              <w:keepNext/>
-            </w:pPr>
-            <w:r>
-              <w:rPr>
-                <w:rFonts w:ascii="Times New Roman" w:cs="Times New Roman" w:eastAsia="Times New Roman" w:hAnsi="Times New Roman"/>
-                <w:b/>
-                <w:bCs/>
-                <w:sz w:val="24"/>
-                <w:szCs w:val="24"/>
-              </w:rPr>
-              <w:t xml:space="preserve">Название</w:t>
-            </w:r>
-          </w:p>
-        </w:tc>
-        <w:tc>
-          <w:tcPr>
-            <w:tcW w:type="dxa" w:w="5000"/>
-            <w:tcMar>
-              <w:top w:type="dxa" w:w="40"/>
-              <w:left w:type="dxa" w:w="100"/>
-              <w:bottom w:type="dxa" w:w="40"/>
-              <w:right w:type="dxa" w:w="100"/>
-            </w:tcMar>
-            <w:vAlign w:val="center"/>
-          </w:tcPr>
-          <w:p>
-            <w:pPr>
-              <w:keepNext/>
-            </w:pPr>
-            <w:r>
-              <w:rPr>
-                <w:rFonts w:ascii="Times New Roman" w:cs="Times New Roman" w:eastAsia="Times New Roman" w:hAnsi="Times New Roman"/>
-                <w:b/>
-                <w:bCs/>
-                <w:sz w:val="24"/>
-                <w:szCs w:val="24"/>
-              </w:rPr>
-              <w:t xml:space="preserve">Простыми словами</w:t>
-            </w:r>
-          </w:p>
-        </w:tc>
-      </w:tr>
-      <w:tr>
-        <w:trPr>
-          <w:cantSplit/>
-        </w:trPr>
-        <w:tc>
-          <w:tcPr>
-            <w:tcW w:type="dxa" w:w="1500"/>
-            <w:tcMar>
-              <w:top w:type="dxa" w:w="40"/>
-              <w:left w:type="dxa" w:w="100"/>
-              <w:bottom w:type="dxa" w:w="40"/>
-              <w:right w:type="dxa" w:w="100"/>
-            </w:tcMar>
-            <w:vAlign w:val="center"/>
-          </w:tcPr>
-          <w:p>
-            <w:pPr>
-              <w:keepNext/>
-            </w:pPr>
-            <w:r>
-              <w:rPr>
-                <w:rFonts w:ascii="Times New Roman" w:cs="Times New Roman" w:eastAsia="Times New Roman" w:hAnsi="Times New Roman"/>
-                <w:b w:val="false"/>
-                <w:bCs w:val="false"/>
-                <w:sz w:val="24"/>
-                <w:szCs w:val="24"/>
-              </w:rPr>
-              <w:t xml:space="preserve">–</w:t>
-            </w:r>
-          </w:p>
-        </w:tc>
-        <w:tc>
-          <w:tcPr>
-            <w:tcW w:type="dxa" w:w="2900"/>
-            <w:tcMar>
-              <w:top w:type="dxa" w:w="40"/>
-              <w:left w:type="dxa" w:w="100"/>
-              <w:bottom w:type="dxa" w:w="40"/>
-              <w:right w:type="dxa" w:w="100"/>
-            </w:tcMar>
-            <w:vAlign w:val="center"/>
-          </w:tcPr>
-          <w:p>
-            <w:pPr>
-              <w:keepNext/>
-            </w:pPr>
-            <w:r>
-              <w:rPr>
-                <w:rFonts w:ascii="Times New Roman" w:cs="Times New Roman" w:eastAsia="Times New Roman" w:hAnsi="Times New Roman"/>
-                <w:b w:val="false"/>
-                <w:bCs w:val="false"/>
-                <w:sz w:val="24"/>
-                <w:szCs w:val="24"/>
-              </w:rPr>
-              <w:t xml:space="preserve">разность</w:t>
-            </w:r>
-          </w:p>
-        </w:tc>
-        <w:tc>
-          <w:tcPr>
-            <w:tcW w:type="dxa" w:w="5000"/>
-            <w:tcMar>
-              <w:top w:type="dxa" w:w="40"/>
-              <w:left w:type="dxa" w:w="100"/>
-              <w:bottom w:type="dxa" w:w="40"/>
-              <w:right w:type="dxa" w:w="100"/>
-            </w:tcMar>
-            <w:vAlign w:val="center"/>
-          </w:tcPr>
-          <w:p>
-            <w:pPr>
-              <w:keepNext/>
-            </w:pPr>
-            <w:r>
-              <w:rPr>
-                <w:rFonts w:ascii="Times New Roman" w:cs="Times New Roman" w:eastAsia="Times New Roman" w:hAnsi="Times New Roman"/>
-                <w:b w:val="false"/>
-                <w:bCs w:val="false"/>
-                <w:sz w:val="24"/>
-                <w:szCs w:val="24"/>
-              </w:rPr>
-              <w:t xml:space="preserve">что есть в первой таблице, но нет во второй</w:t>
-            </w:r>
-          </w:p>
-        </w:tc>
-      </w:tr>
-      <w:tr>
-        <w:trPr>
-          <w:cantSplit/>
-        </w:trPr>
-        <w:tc>
-          <w:tcPr>
-            <w:tcW w:type="dxa" w:w="1500"/>
-            <w:tcMar>
-              <w:top w:type="dxa" w:w="40"/>
-              <w:left w:type="dxa" w:w="100"/>
-              <w:bottom w:type="dxa" w:w="40"/>
-              <w:right w:type="dxa" w:w="100"/>
-            </w:tcMar>
-            <w:vAlign w:val="center"/>
-          </w:tcPr>
-          <w:p>
-            <w:pPr>
-              <w:keepNext/>
-            </w:pPr>
-            <w:r>
-              <w:rPr>
-                <w:rFonts w:ascii="Times New Roman" w:cs="Times New Roman" w:eastAsia="Times New Roman" w:hAnsi="Times New Roman"/>
-                <w:b w:val="false"/>
-                <w:bCs w:val="false"/>
-                <w:sz w:val="24"/>
-                <w:szCs w:val="24"/>
-              </w:rPr>
-              <w:t xml:space="preserve">∪</w:t>
-            </w:r>
-          </w:p>
-        </w:tc>
-        <w:tc>
-          <w:tcPr>
-            <w:tcW w:type="dxa" w:w="2900"/>
-            <w:tcMar>
-              <w:top w:type="dxa" w:w="40"/>
-              <w:left w:type="dxa" w:w="100"/>
-              <w:bottom w:type="dxa" w:w="40"/>
-              <w:right w:type="dxa" w:w="100"/>
-            </w:tcMar>
-            <w:vAlign w:val="center"/>
-          </w:tcPr>
-          <w:p>
-            <w:pPr>
-              <w:keepNext/>
-            </w:pPr>
-            <w:r>
-              <w:rPr>
-                <w:rFonts w:ascii="Times New Roman" w:cs="Times New Roman" w:eastAsia="Times New Roman" w:hAnsi="Times New Roman"/>
-                <w:b w:val="false"/>
-                <w:bCs w:val="false"/>
-                <w:sz w:val="24"/>
-                <w:szCs w:val="24"/>
-              </w:rPr>
-              <w:t xml:space="preserve">объединение</w:t>
-            </w:r>
-          </w:p>
-        </w:tc>
-        <w:tc>
-          <w:tcPr>
-            <w:tcW w:type="dxa" w:w="5000"/>
-            <w:tcMar>
-              <w:top w:type="dxa" w:w="40"/>
-              <w:left w:type="dxa" w:w="100"/>
-              <w:bottom w:type="dxa" w:w="40"/>
-              <w:right w:type="dxa" w:w="100"/>
-            </w:tcMar>
-            <w:vAlign w:val="center"/>
-          </w:tcPr>
-          <w:p>
-            <w:pPr>
-              <w:keepNext/>
-            </w:pPr>
-            <w:r>
-              <w:rPr>
-                <w:rFonts w:ascii="Times New Roman" w:cs="Times New Roman" w:eastAsia="Times New Roman" w:hAnsi="Times New Roman"/>
-                <w:b w:val="false"/>
-                <w:bCs w:val="false"/>
-                <w:sz w:val="24"/>
-                <w:szCs w:val="24"/>
-              </w:rPr>
-              <w:t xml:space="preserve">все из обеих таблиц, без повторов</w:t>
-            </w:r>
-          </w:p>
-        </w:tc>
-      </w:tr>
-      <w:tr>
-        <w:trPr>
-          <w:cantSplit/>
-        </w:trPr>
-        <w:tc>
-          <w:tcPr>
-            <w:tcW w:type="dxa" w:w="1500"/>
-            <w:tcMar>
-              <w:top w:type="dxa" w:w="40"/>
-              <w:left w:type="dxa" w:w="100"/>
-              <w:bottom w:type="dxa" w:w="40"/>
-              <w:right w:type="dxa" w:w="100"/>
-            </w:tcMar>
-            <w:vAlign w:val="center"/>
-          </w:tcPr>
-          <w:p>
-            <w:pPr>
-              <w:keepNext/>
-            </w:pPr>
-            <w:r>
-              <w:rPr>
-                <w:rFonts w:ascii="Times New Roman" w:cs="Times New Roman" w:eastAsia="Times New Roman" w:hAnsi="Times New Roman"/>
-                <w:b w:val="false"/>
-                <w:bCs w:val="false"/>
-                <w:sz w:val="24"/>
-                <w:szCs w:val="24"/>
-              </w:rPr>
-              <w:t xml:space="preserve">×</w:t>
-            </w:r>
-          </w:p>
-        </w:tc>
-        <w:tc>
-          <w:tcPr>
-            <w:tcW w:type="dxa" w:w="2900"/>
-            <w:tcMar>
-              <w:top w:type="dxa" w:w="40"/>
-              <w:left w:type="dxa" w:w="100"/>
-              <w:bottom w:type="dxa" w:w="40"/>
-              <w:right w:type="dxa" w:w="100"/>
-            </w:tcMar>
-            <w:vAlign w:val="center"/>
-          </w:tcPr>
-          <w:p>
-            <w:pPr>
-              <w:keepNext/>
-            </w:pPr>
-            <w:r>
-              <w:rPr>
-                <w:rFonts w:ascii="Times New Roman" w:cs="Times New Roman" w:eastAsia="Times New Roman" w:hAnsi="Times New Roman"/>
-                <w:b w:val="false"/>
-                <w:bCs w:val="false"/>
-                <w:sz w:val="24"/>
-                <w:szCs w:val="24"/>
-              </w:rPr>
-              <w:t xml:space="preserve">декартово произведение</w:t>
-            </w:r>
-          </w:p>
-        </w:tc>
-        <w:tc>
-          <w:tcPr>
-            <w:tcW w:type="dxa" w:w="5000"/>
-            <w:tcMar>
-              <w:top w:type="dxa" w:w="40"/>
-              <w:left w:type="dxa" w:w="100"/>
-              <w:bottom w:type="dxa" w:w="40"/>
-              <w:right w:type="dxa" w:w="100"/>
-            </w:tcMar>
-            <w:vAlign w:val="center"/>
-          </w:tcPr>
-          <w:p>
-            <w:pPr>
-              <w:keepNext/>
-            </w:pPr>
-            <w:r>
-              <w:rPr>
-                <w:rFonts w:ascii="Times New Roman" w:cs="Times New Roman" w:eastAsia="Times New Roman" w:hAnsi="Times New Roman"/>
-                <w:b w:val="false"/>
-                <w:bCs w:val="false"/>
-                <w:sz w:val="24"/>
-                <w:szCs w:val="24"/>
-              </w:rPr>
-              <w:t xml:space="preserve">все возможные пары строк</w:t>
-            </w:r>
-          </w:p>
-        </w:tc>
-      </w:tr>
-      <w:tr>
-        <w:trPr>
-          <w:cantSplit/>
-        </w:trPr>
-        <w:tc>
-          <w:tcPr>
-            <w:tcW w:type="dxa" w:w="1500"/>
-            <w:tcMar>
-              <w:top w:type="dxa" w:w="40"/>
-              <w:left w:type="dxa" w:w="100"/>
-              <w:bottom w:type="dxa" w:w="40"/>
-              <w:right w:type="dxa" w:w="100"/>
-            </w:tcMar>
-            <w:vAlign w:val="center"/>
-          </w:tcPr>
-          <w:p>
-            <w:pPr>
-              <w:keepNext/>
-            </w:pPr>
-            <w:r>
-              <w:rPr>
-                <w:rFonts w:ascii="Times New Roman" w:cs="Times New Roman" w:eastAsia="Times New Roman" w:hAnsi="Times New Roman"/>
-                <w:b w:val="false"/>
-                <w:bCs w:val="false"/>
-                <w:sz w:val="24"/>
-                <w:szCs w:val="24"/>
-              </w:rPr>
-              <w:t xml:space="preserve">Where</w:t>
-            </w:r>
-          </w:p>
-        </w:tc>
-        <w:tc>
-          <w:tcPr>
-            <w:tcW w:type="dxa" w:w="2900"/>
-            <w:tcMar>
-              <w:top w:type="dxa" w:w="40"/>
-              <w:left w:type="dxa" w:w="100"/>
-              <w:bottom w:type="dxa" w:w="40"/>
-              <w:right w:type="dxa" w:w="100"/>
-            </w:tcMar>
-            <w:vAlign w:val="center"/>
-          </w:tcPr>
-          <w:p>
-            <w:pPr>
-              <w:keepNext/>
-            </w:pPr>
-            <w:r>
-              <w:rPr>
-                <w:rFonts w:ascii="Times New Roman" w:cs="Times New Roman" w:eastAsia="Times New Roman" w:hAnsi="Times New Roman"/>
-                <w:b w:val="false"/>
-                <w:bCs w:val="false"/>
-                <w:sz w:val="24"/>
-                <w:szCs w:val="24"/>
-              </w:rPr>
-              <w:t xml:space="preserve">выборка</w:t>
-            </w:r>
-          </w:p>
-        </w:tc>
-        <w:tc>
-          <w:tcPr>
-            <w:tcW w:type="dxa" w:w="5000"/>
-            <w:tcMar>
-              <w:top w:type="dxa" w:w="40"/>
-              <w:left w:type="dxa" w:w="100"/>
-              <w:bottom w:type="dxa" w:w="40"/>
-              <w:right w:type="dxa" w:w="100"/>
-            </w:tcMar>
-            <w:vAlign w:val="center"/>
-          </w:tcPr>
-          <w:p>
-            <w:pPr>
-              <w:keepNext/>
-            </w:pPr>
-            <w:r>
-              <w:rPr>
-                <w:rFonts w:ascii="Times New Roman" w:cs="Times New Roman" w:eastAsia="Times New Roman" w:hAnsi="Times New Roman"/>
-                <w:b w:val="false"/>
-                <w:bCs w:val="false"/>
-                <w:sz w:val="24"/>
-                <w:szCs w:val="24"/>
-              </w:rPr>
-              <w:t xml:space="preserve">оставить строки по условию</w:t>
-            </w:r>
-          </w:p>
-        </w:tc>
-      </w:tr>
-      <w:tr>
-        <w:trPr>
-          <w:cantSplit/>
-        </w:trPr>
-        <w:tc>
-          <w:tcPr>
-            <w:tcW w:type="dxa" w:w="1500"/>
-            <w:tcMar>
-              <w:top w:type="dxa" w:w="40"/>
-              <w:left w:type="dxa" w:w="100"/>
-              <w:bottom w:type="dxa" w:w="40"/>
-              <w:right w:type="dxa" w:w="100"/>
-            </w:tcMar>
-            <w:vAlign w:val="center"/>
-          </w:tcPr>
-          <w:p>
-            <w:pPr>
-              <w:keepNext/>
-            </w:pPr>
-            <w:r>
-              <w:rPr>
-                <w:rFonts w:ascii="Times New Roman" w:cs="Times New Roman" w:eastAsia="Times New Roman" w:hAnsi="Times New Roman"/>
-                <w:b w:val="false"/>
-                <w:bCs w:val="false"/>
-                <w:sz w:val="24"/>
-                <w:szCs w:val="24"/>
-              </w:rPr>
-              <w:t xml:space="preserve">Projection</w:t>
-            </w:r>
-          </w:p>
-        </w:tc>
-        <w:tc>
-          <w:tcPr>
-            <w:tcW w:type="dxa" w:w="2900"/>
-            <w:tcMar>
-              <w:top w:type="dxa" w:w="40"/>
-              <w:left w:type="dxa" w:w="100"/>
-              <w:bottom w:type="dxa" w:w="40"/>
-              <w:right w:type="dxa" w:w="100"/>
-            </w:tcMar>
-            <w:vAlign w:val="center"/>
-          </w:tcPr>
-          <w:p>
-            <w:pPr>
-              <w:keepNext/>
-            </w:pPr>
-            <w:r>
-              <w:rPr>
-                <w:rFonts w:ascii="Times New Roman" w:cs="Times New Roman" w:eastAsia="Times New Roman" w:hAnsi="Times New Roman"/>
-                <w:b w:val="false"/>
-                <w:bCs w:val="false"/>
-                <w:sz w:val="24"/>
-                <w:szCs w:val="24"/>
-              </w:rPr>
-              <w:t xml:space="preserve">проекция</w:t>
-            </w:r>
-          </w:p>
-        </w:tc>
-        <w:tc>
-          <w:tcPr>
-            <w:tcW w:type="dxa" w:w="5000"/>
-            <w:tcMar>
-              <w:top w:type="dxa" w:w="40"/>
-              <w:left w:type="dxa" w:w="100"/>
-              <w:bottom w:type="dxa" w:w="40"/>
-              <w:right w:type="dxa" w:w="100"/>
-            </w:tcMar>
-            <w:vAlign w:val="center"/>
-          </w:tcPr>
-          <w:p>
-            <w:pPr>
-              <w:keepNext/>
-            </w:pPr>
-            <w:r>
-              <w:rPr>
-                <w:rFonts w:ascii="Times New Roman" w:cs="Times New Roman" w:eastAsia="Times New Roman" w:hAnsi="Times New Roman"/>
-                <w:b w:val="false"/>
-                <w:bCs w:val="false"/>
-                <w:sz w:val="24"/>
-                <w:szCs w:val="24"/>
-              </w:rPr>
-              <w:t xml:space="preserve">оставить только нужные столбцы</w:t>
-            </w:r>
-          </w:p>
-        </w:tc>
-      </w:tr>
-    </w:tbl>
-    <w:p>
-      <w:pPr>
-        <w:spacing w:after="120"/>
-      </w:pPr>
+        <w:t xml:space="preserve">Вывод</w:t>
+      </w:r>
     </w:p>
     <w:p>
       <w:pPr>
@@ -3856,25 +3307,7 @@
           <w:sz w:val="28"/>
           <w:szCs w:val="28"/>
         </w:rPr>
-        <w:t xml:space="preserve">Главное запомнить: </w:t>
-      </w:r>
-      <w:r>
-        <w:rPr>
-          <w:rFonts w:ascii="Times New Roman" w:cs="Times New Roman" w:eastAsia="Times New Roman" w:hAnsi="Times New Roman"/>
-          <w:b/>
-          <w:bCs/>
-          <w:sz w:val="28"/>
-          <w:szCs w:val="28"/>
-        </w:rPr>
-        <w:t xml:space="preserve">Where режет по строкам, Projection режет по столбцам</w:t>
-      </w:r>
-      <w:r>
-        <w:rPr>
-          <w:rFonts w:ascii="Times New Roman" w:cs="Times New Roman" w:eastAsia="Times New Roman" w:hAnsi="Times New Roman"/>
-          <w:sz w:val="28"/>
-          <w:szCs w:val="28"/>
-        </w:rPr>
-        <w:t xml:space="preserve">. На защите могут спросить, почему в разность попала Молдова: из-за разного написания столицы, «Кишенев» и «Кишинев».</w:t>
+        <w:t xml:space="preserve">В ходе работы были выполнены операции реляционной алгебры над отношениями A, B и C. Разность C – B дала три кортежа, а после объединения с A получилось 9 кортежей. С помощью выборки получены отношения M и N по две строки, их декартово произведение дало 4 кортежа, а проекция оставила в них только названия стран. Также стало понятно, что кортежи сравниваются по всем атрибутам целиком, поэтому даже различие в одной букве («Кишенев» и «Кишинев») влияет на результат.</w:t>
       </w:r>
     </w:p>
     <w:sectPr>

</xml_diff>

<commit_message>
Add source data section to task 1 explanation
Co-Authored-By: Claude Opus 5.5 <noreply@anthropic.com>
Claude-Session: https://claude.ai/code/session_01M8pUE3adzgGc2WqjPvNRzN
</commit_message>
<xml_diff>
--- a/Lab1/zadanie1_razbor.docx
+++ b/Lab1/zadanie1_razbor.docx
@@ -41,6 +41,1899 @@
           <w:szCs w:val="28"/>
         </w:rPr>
         <w:t xml:space="preserve"> познакомиться с основными понятиями реляционных баз данных и принципами работы с ними, получить представление об отношении и его составляющих, научиться описывать объекты реального мира с помощью отношений. Также разобраться в понятии ключа и его видах и применить полученные знания на практике.</w:t>
+      </w:r>
+    </w:p>
+    <w:p>
+      <w:pPr>
+        <w:keepNext/>
+        <w:spacing w:after="120" w:before="360" w:line="360"/>
+      </w:pPr>
+      <w:r>
+        <w:rPr>
+          <w:rFonts w:ascii="Times New Roman" w:cs="Times New Roman" w:eastAsia="Times New Roman" w:hAnsi="Times New Roman"/>
+          <w:b/>
+          <w:bCs/>
+          <w:sz w:val="30"/>
+          <w:szCs w:val="30"/>
+        </w:rPr>
+        <w:t xml:space="preserve">Исходные данные</w:t>
+      </w:r>
+    </w:p>
+    <w:p>
+      <w:pPr>
+        <w:spacing w:after="0" w:before="0" w:line="360"/>
+        <w:ind w:firstLine="709"/>
+        <w:jc w:val="both"/>
+      </w:pPr>
+      <w:r>
+        <w:rPr>
+          <w:rFonts w:ascii="Times New Roman" w:cs="Times New Roman" w:eastAsia="Times New Roman" w:hAnsi="Times New Roman"/>
+          <w:sz w:val="28"/>
+          <w:szCs w:val="28"/>
+        </w:rPr>
+        <w:t xml:space="preserve">Вариант 1, задание 1. Даны три отношения A, B и C. В каждом два атрибута: col_1 (Страна) и col_2 (Столица).</w:t>
+      </w:r>
+    </w:p>
+    <w:p>
+      <w:pPr>
+        <w:spacing w:after="120"/>
+      </w:pPr>
+    </w:p>
+    <w:tbl>
+      <w:tblPr>
+        <w:tblW w:type="dxa" w:w="9300"/>
+        <w:jc w:val="center"/>
+        <w:tblBorders>
+          <w:top w:val="none" w:color="FFFFFF" w:sz="0"/>
+          <w:left w:val="none" w:color="FFFFFF" w:sz="0"/>
+          <w:bottom w:val="none" w:color="FFFFFF" w:sz="0"/>
+          <w:right w:val="none" w:color="FFFFFF" w:sz="0"/>
+          <w:insideH w:val="none" w:color="FFFFFF" w:sz="0"/>
+          <w:insideV w:val="none" w:color="FFFFFF" w:sz="0"/>
+        </w:tblBorders>
+        <w:tblLayout w:type="fixed"/>
+      </w:tblPr>
+      <w:tblGrid>
+        <w:gridCol w:w="3100"/>
+        <w:gridCol w:w="3100"/>
+        <w:gridCol w:w="3100"/>
+      </w:tblGrid>
+      <w:tr>
+        <w:tc>
+          <w:tcPr>
+            <w:tcW w:type="dxa" w:w="3100"/>
+            <w:tcBorders>
+              <w:top w:val="none" w:color="FFFFFF" w:sz="0"/>
+              <w:left w:val="none" w:color="FFFFFF" w:sz="0"/>
+              <w:bottom w:val="none" w:color="FFFFFF" w:sz="0"/>
+              <w:right w:val="none" w:color="FFFFFF" w:sz="0"/>
+            </w:tcBorders>
+            <w:vAlign w:val="top"/>
+          </w:tcPr>
+          <w:p>
+            <w:pPr>
+              <w:keepNext/>
+              <w:jc w:val="center"/>
+            </w:pPr>
+            <w:r>
+              <w:rPr>
+                <w:rFonts w:ascii="Times New Roman" w:cs="Times New Roman" w:eastAsia="Times New Roman" w:hAnsi="Times New Roman"/>
+                <w:b/>
+                <w:bCs/>
+                <w:sz w:val="28"/>
+                <w:szCs w:val="28"/>
+              </w:rPr>
+              <w:t xml:space="preserve">A</w:t>
+            </w:r>
+          </w:p>
+          <w:tbl>
+            <w:tblPr>
+              <w:tblW w:type="dxa" w:w="3000"/>
+              <w:jc w:val="center"/>
+              <w:tblBorders>
+                <w:top w:val="single" w:color="auto" w:sz="4"/>
+                <w:left w:val="single" w:color="auto" w:sz="4"/>
+                <w:bottom w:val="single" w:color="auto" w:sz="4"/>
+                <w:right w:val="single" w:color="auto" w:sz="4"/>
+                <w:insideH w:val="single" w:color="auto" w:sz="4"/>
+                <w:insideV w:val="single" w:color="auto" w:sz="4"/>
+              </w:tblBorders>
+              <w:tblLayout w:type="fixed"/>
+            </w:tblPr>
+            <w:tblGrid>
+              <w:gridCol w:w="1780"/>
+              <w:gridCol w:w="1220"/>
+            </w:tblGrid>
+            <w:tr>
+              <w:trPr>
+                <w:tblHeader/>
+              </w:trPr>
+              <w:tc>
+                <w:tcPr>
+                  <w:tcW w:type="dxa" w:w="1780"/>
+                  <w:tcMar>
+                    <w:top w:type="dxa" w:w="40"/>
+                    <w:left w:type="dxa" w:w="100"/>
+                    <w:bottom w:type="dxa" w:w="40"/>
+                    <w:right w:type="dxa" w:w="100"/>
+                  </w:tcMar>
+                  <w:vAlign w:val="center"/>
+                </w:tcPr>
+                <w:p>
+                  <w:pPr>
+                    <w:keepNext/>
+                  </w:pPr>
+                  <w:r>
+                    <w:rPr>
+                      <w:rFonts w:ascii="Times New Roman" w:cs="Times New Roman" w:eastAsia="Times New Roman" w:hAnsi="Times New Roman"/>
+                      <w:b/>
+                      <w:bCs/>
+                      <w:sz w:val="24"/>
+                      <w:szCs w:val="24"/>
+                    </w:rPr>
+                    <w:t xml:space="preserve">Страна</w:t>
+                  </w:r>
+                </w:p>
+              </w:tc>
+              <w:tc>
+                <w:tcPr>
+                  <w:tcW w:type="dxa" w:w="1220"/>
+                  <w:tcMar>
+                    <w:top w:type="dxa" w:w="40"/>
+                    <w:left w:type="dxa" w:w="100"/>
+                    <w:bottom w:type="dxa" w:w="40"/>
+                    <w:right w:type="dxa" w:w="100"/>
+                  </w:tcMar>
+                  <w:vAlign w:val="center"/>
+                </w:tcPr>
+                <w:p>
+                  <w:pPr>
+                    <w:keepNext/>
+                  </w:pPr>
+                  <w:r>
+                    <w:rPr>
+                      <w:rFonts w:ascii="Times New Roman" w:cs="Times New Roman" w:eastAsia="Times New Roman" w:hAnsi="Times New Roman"/>
+                      <w:b/>
+                      <w:bCs/>
+                      <w:sz w:val="24"/>
+                      <w:szCs w:val="24"/>
+                    </w:rPr>
+                    <w:t xml:space="preserve">Столица</w:t>
+                  </w:r>
+                </w:p>
+              </w:tc>
+            </w:tr>
+            <w:tr>
+              <w:trPr>
+                <w:cantSplit/>
+              </w:trPr>
+              <w:tc>
+                <w:tcPr>
+                  <w:tcW w:type="dxa" w:w="1780"/>
+                  <w:tcMar>
+                    <w:top w:type="dxa" w:w="40"/>
+                    <w:left w:type="dxa" w:w="100"/>
+                    <w:bottom w:type="dxa" w:w="40"/>
+                    <w:right w:type="dxa" w:w="100"/>
+                  </w:tcMar>
+                  <w:vAlign w:val="center"/>
+                </w:tcPr>
+                <w:p>
+                  <w:pPr>
+                    <w:keepNext/>
+                  </w:pPr>
+                  <w:r>
+                    <w:rPr>
+                      <w:rFonts w:ascii="Times New Roman" w:cs="Times New Roman" w:eastAsia="Times New Roman" w:hAnsi="Times New Roman"/>
+                      <w:b w:val="false"/>
+                      <w:bCs w:val="false"/>
+                      <w:sz w:val="24"/>
+                      <w:szCs w:val="24"/>
+                    </w:rPr>
+                    <w:t xml:space="preserve">Армения</w:t>
+                  </w:r>
+                </w:p>
+              </w:tc>
+              <w:tc>
+                <w:tcPr>
+                  <w:tcW w:type="dxa" w:w="1220"/>
+                  <w:tcMar>
+                    <w:top w:type="dxa" w:w="40"/>
+                    <w:left w:type="dxa" w:w="100"/>
+                    <w:bottom w:type="dxa" w:w="40"/>
+                    <w:right w:type="dxa" w:w="100"/>
+                  </w:tcMar>
+                  <w:vAlign w:val="center"/>
+                </w:tcPr>
+                <w:p>
+                  <w:pPr>
+                    <w:keepNext/>
+                  </w:pPr>
+                  <w:r>
+                    <w:rPr>
+                      <w:rFonts w:ascii="Times New Roman" w:cs="Times New Roman" w:eastAsia="Times New Roman" w:hAnsi="Times New Roman"/>
+                      <w:b w:val="false"/>
+                      <w:bCs w:val="false"/>
+                      <w:sz w:val="24"/>
+                      <w:szCs w:val="24"/>
+                    </w:rPr>
+                    <w:t xml:space="preserve">Ереван</w:t>
+                  </w:r>
+                </w:p>
+              </w:tc>
+            </w:tr>
+            <w:tr>
+              <w:trPr>
+                <w:cantSplit/>
+              </w:trPr>
+              <w:tc>
+                <w:tcPr>
+                  <w:tcW w:type="dxa" w:w="1780"/>
+                  <w:tcMar>
+                    <w:top w:type="dxa" w:w="40"/>
+                    <w:left w:type="dxa" w:w="100"/>
+                    <w:bottom w:type="dxa" w:w="40"/>
+                    <w:right w:type="dxa" w:w="100"/>
+                  </w:tcMar>
+                  <w:vAlign w:val="center"/>
+                </w:tcPr>
+                <w:p>
+                  <w:pPr>
+                    <w:keepNext/>
+                  </w:pPr>
+                  <w:r>
+                    <w:rPr>
+                      <w:rFonts w:ascii="Times New Roman" w:cs="Times New Roman" w:eastAsia="Times New Roman" w:hAnsi="Times New Roman"/>
+                      <w:b w:val="false"/>
+                      <w:bCs w:val="false"/>
+                      <w:sz w:val="24"/>
+                      <w:szCs w:val="24"/>
+                    </w:rPr>
+                    <w:t xml:space="preserve">Азербайджан</w:t>
+                  </w:r>
+                </w:p>
+              </w:tc>
+              <w:tc>
+                <w:tcPr>
+                  <w:tcW w:type="dxa" w:w="1220"/>
+                  <w:tcMar>
+                    <w:top w:type="dxa" w:w="40"/>
+                    <w:left w:type="dxa" w:w="100"/>
+                    <w:bottom w:type="dxa" w:w="40"/>
+                    <w:right w:type="dxa" w:w="100"/>
+                  </w:tcMar>
+                  <w:vAlign w:val="center"/>
+                </w:tcPr>
+                <w:p>
+                  <w:pPr>
+                    <w:keepNext/>
+                  </w:pPr>
+                  <w:r>
+                    <w:rPr>
+                      <w:rFonts w:ascii="Times New Roman" w:cs="Times New Roman" w:eastAsia="Times New Roman" w:hAnsi="Times New Roman"/>
+                      <w:b w:val="false"/>
+                      <w:bCs w:val="false"/>
+                      <w:sz w:val="24"/>
+                      <w:szCs w:val="24"/>
+                    </w:rPr>
+                    <w:t xml:space="preserve">Баку</w:t>
+                  </w:r>
+                </w:p>
+              </w:tc>
+            </w:tr>
+            <w:tr>
+              <w:trPr>
+                <w:cantSplit/>
+              </w:trPr>
+              <w:tc>
+                <w:tcPr>
+                  <w:tcW w:type="dxa" w:w="1780"/>
+                  <w:tcMar>
+                    <w:top w:type="dxa" w:w="40"/>
+                    <w:left w:type="dxa" w:w="100"/>
+                    <w:bottom w:type="dxa" w:w="40"/>
+                    <w:right w:type="dxa" w:w="100"/>
+                  </w:tcMar>
+                  <w:vAlign w:val="center"/>
+                </w:tcPr>
+                <w:p>
+                  <w:pPr>
+                    <w:keepNext/>
+                  </w:pPr>
+                  <w:r>
+                    <w:rPr>
+                      <w:rFonts w:ascii="Times New Roman" w:cs="Times New Roman" w:eastAsia="Times New Roman" w:hAnsi="Times New Roman"/>
+                      <w:b w:val="false"/>
+                      <w:bCs w:val="false"/>
+                      <w:sz w:val="24"/>
+                      <w:szCs w:val="24"/>
+                    </w:rPr>
+                    <w:t xml:space="preserve">Беларусь</w:t>
+                  </w:r>
+                </w:p>
+              </w:tc>
+              <w:tc>
+                <w:tcPr>
+                  <w:tcW w:type="dxa" w:w="1220"/>
+                  <w:tcMar>
+                    <w:top w:type="dxa" w:w="40"/>
+                    <w:left w:type="dxa" w:w="100"/>
+                    <w:bottom w:type="dxa" w:w="40"/>
+                    <w:right w:type="dxa" w:w="100"/>
+                  </w:tcMar>
+                  <w:vAlign w:val="center"/>
+                </w:tcPr>
+                <w:p>
+                  <w:pPr>
+                    <w:keepNext/>
+                  </w:pPr>
+                  <w:r>
+                    <w:rPr>
+                      <w:rFonts w:ascii="Times New Roman" w:cs="Times New Roman" w:eastAsia="Times New Roman" w:hAnsi="Times New Roman"/>
+                      <w:b w:val="false"/>
+                      <w:bCs w:val="false"/>
+                      <w:sz w:val="24"/>
+                      <w:szCs w:val="24"/>
+                    </w:rPr>
+                    <w:t xml:space="preserve">Минск</w:t>
+                  </w:r>
+                </w:p>
+              </w:tc>
+            </w:tr>
+            <w:tr>
+              <w:trPr>
+                <w:cantSplit/>
+              </w:trPr>
+              <w:tc>
+                <w:tcPr>
+                  <w:tcW w:type="dxa" w:w="1780"/>
+                  <w:tcMar>
+                    <w:top w:type="dxa" w:w="40"/>
+                    <w:left w:type="dxa" w:w="100"/>
+                    <w:bottom w:type="dxa" w:w="40"/>
+                    <w:right w:type="dxa" w:w="100"/>
+                  </w:tcMar>
+                  <w:vAlign w:val="center"/>
+                </w:tcPr>
+                <w:p>
+                  <w:pPr>
+                    <w:keepNext/>
+                  </w:pPr>
+                  <w:r>
+                    <w:rPr>
+                      <w:rFonts w:ascii="Times New Roman" w:cs="Times New Roman" w:eastAsia="Times New Roman" w:hAnsi="Times New Roman"/>
+                      <w:b w:val="false"/>
+                      <w:bCs w:val="false"/>
+                      <w:sz w:val="24"/>
+                      <w:szCs w:val="24"/>
+                    </w:rPr>
+                    <w:t xml:space="preserve">Грузия</w:t>
+                  </w:r>
+                </w:p>
+              </w:tc>
+              <w:tc>
+                <w:tcPr>
+                  <w:tcW w:type="dxa" w:w="1220"/>
+                  <w:tcMar>
+                    <w:top w:type="dxa" w:w="40"/>
+                    <w:left w:type="dxa" w:w="100"/>
+                    <w:bottom w:type="dxa" w:w="40"/>
+                    <w:right w:type="dxa" w:w="100"/>
+                  </w:tcMar>
+                  <w:vAlign w:val="center"/>
+                </w:tcPr>
+                <w:p>
+                  <w:pPr>
+                    <w:keepNext/>
+                  </w:pPr>
+                  <w:r>
+                    <w:rPr>
+                      <w:rFonts w:ascii="Times New Roman" w:cs="Times New Roman" w:eastAsia="Times New Roman" w:hAnsi="Times New Roman"/>
+                      <w:b w:val="false"/>
+                      <w:bCs w:val="false"/>
+                      <w:sz w:val="24"/>
+                      <w:szCs w:val="24"/>
+                    </w:rPr>
+                    <w:t xml:space="preserve">Тбилиси</w:t>
+                  </w:r>
+                </w:p>
+              </w:tc>
+            </w:tr>
+            <w:tr>
+              <w:trPr>
+                <w:cantSplit/>
+              </w:trPr>
+              <w:tc>
+                <w:tcPr>
+                  <w:tcW w:type="dxa" w:w="1780"/>
+                  <w:tcMar>
+                    <w:top w:type="dxa" w:w="40"/>
+                    <w:left w:type="dxa" w:w="100"/>
+                    <w:bottom w:type="dxa" w:w="40"/>
+                    <w:right w:type="dxa" w:w="100"/>
+                  </w:tcMar>
+                  <w:vAlign w:val="center"/>
+                </w:tcPr>
+                <w:p>
+                  <w:pPr>
+                    <w:keepNext/>
+                  </w:pPr>
+                  <w:r>
+                    <w:rPr>
+                      <w:rFonts w:ascii="Times New Roman" w:cs="Times New Roman" w:eastAsia="Times New Roman" w:hAnsi="Times New Roman"/>
+                      <w:b w:val="false"/>
+                      <w:bCs w:val="false"/>
+                      <w:sz w:val="24"/>
+                      <w:szCs w:val="24"/>
+                    </w:rPr>
+                    <w:t xml:space="preserve">Казахстан</w:t>
+                  </w:r>
+                </w:p>
+              </w:tc>
+              <w:tc>
+                <w:tcPr>
+                  <w:tcW w:type="dxa" w:w="1220"/>
+                  <w:tcMar>
+                    <w:top w:type="dxa" w:w="40"/>
+                    <w:left w:type="dxa" w:w="100"/>
+                    <w:bottom w:type="dxa" w:w="40"/>
+                    <w:right w:type="dxa" w:w="100"/>
+                  </w:tcMar>
+                  <w:vAlign w:val="center"/>
+                </w:tcPr>
+                <w:p>
+                  <w:pPr>
+                    <w:keepNext/>
+                  </w:pPr>
+                  <w:r>
+                    <w:rPr>
+                      <w:rFonts w:ascii="Times New Roman" w:cs="Times New Roman" w:eastAsia="Times New Roman" w:hAnsi="Times New Roman"/>
+                      <w:b w:val="false"/>
+                      <w:bCs w:val="false"/>
+                      <w:sz w:val="24"/>
+                      <w:szCs w:val="24"/>
+                    </w:rPr>
+                    <w:t xml:space="preserve">Астана</w:t>
+                  </w:r>
+                </w:p>
+              </w:tc>
+            </w:tr>
+            <w:tr>
+              <w:trPr>
+                <w:cantSplit/>
+              </w:trPr>
+              <w:tc>
+                <w:tcPr>
+                  <w:tcW w:type="dxa" w:w="1780"/>
+                  <w:tcMar>
+                    <w:top w:type="dxa" w:w="40"/>
+                    <w:left w:type="dxa" w:w="100"/>
+                    <w:bottom w:type="dxa" w:w="40"/>
+                    <w:right w:type="dxa" w:w="100"/>
+                  </w:tcMar>
+                  <w:vAlign w:val="center"/>
+                </w:tcPr>
+                <w:p>
+                  <w:pPr>
+                    <w:keepNext/>
+                  </w:pPr>
+                  <w:r>
+                    <w:rPr>
+                      <w:rFonts w:ascii="Times New Roman" w:cs="Times New Roman" w:eastAsia="Times New Roman" w:hAnsi="Times New Roman"/>
+                      <w:b w:val="false"/>
+                      <w:bCs w:val="false"/>
+                      <w:sz w:val="24"/>
+                      <w:szCs w:val="24"/>
+                    </w:rPr>
+                    <w:t xml:space="preserve">Кыргызстан</w:t>
+                  </w:r>
+                </w:p>
+              </w:tc>
+              <w:tc>
+                <w:tcPr>
+                  <w:tcW w:type="dxa" w:w="1220"/>
+                  <w:tcMar>
+                    <w:top w:type="dxa" w:w="40"/>
+                    <w:left w:type="dxa" w:w="100"/>
+                    <w:bottom w:type="dxa" w:w="40"/>
+                    <w:right w:type="dxa" w:w="100"/>
+                  </w:tcMar>
+                  <w:vAlign w:val="center"/>
+                </w:tcPr>
+                <w:p>
+                  <w:pPr>
+                    <w:keepNext/>
+                  </w:pPr>
+                  <w:r>
+                    <w:rPr>
+                      <w:rFonts w:ascii="Times New Roman" w:cs="Times New Roman" w:eastAsia="Times New Roman" w:hAnsi="Times New Roman"/>
+                      <w:b w:val="false"/>
+                      <w:bCs w:val="false"/>
+                      <w:sz w:val="24"/>
+                      <w:szCs w:val="24"/>
+                    </w:rPr>
+                    <w:t xml:space="preserve">Бишкек</w:t>
+                  </w:r>
+                </w:p>
+              </w:tc>
+            </w:tr>
+          </w:tbl>
+          <w:p/>
+        </w:tc>
+        <w:tc>
+          <w:tcPr>
+            <w:tcW w:type="dxa" w:w="3100"/>
+            <w:tcBorders>
+              <w:top w:val="none" w:color="FFFFFF" w:sz="0"/>
+              <w:left w:val="none" w:color="FFFFFF" w:sz="0"/>
+              <w:bottom w:val="none" w:color="FFFFFF" w:sz="0"/>
+              <w:right w:val="none" w:color="FFFFFF" w:sz="0"/>
+            </w:tcBorders>
+            <w:vAlign w:val="top"/>
+          </w:tcPr>
+          <w:p>
+            <w:pPr>
+              <w:keepNext/>
+              <w:jc w:val="center"/>
+            </w:pPr>
+            <w:r>
+              <w:rPr>
+                <w:rFonts w:ascii="Times New Roman" w:cs="Times New Roman" w:eastAsia="Times New Roman" w:hAnsi="Times New Roman"/>
+                <w:b/>
+                <w:bCs/>
+                <w:sz w:val="28"/>
+                <w:szCs w:val="28"/>
+              </w:rPr>
+              <w:t xml:space="preserve">B</w:t>
+            </w:r>
+          </w:p>
+          <w:tbl>
+            <w:tblPr>
+              <w:tblW w:type="dxa" w:w="3000"/>
+              <w:jc w:val="center"/>
+              <w:tblBorders>
+                <w:top w:val="single" w:color="auto" w:sz="4"/>
+                <w:left w:val="single" w:color="auto" w:sz="4"/>
+                <w:bottom w:val="single" w:color="auto" w:sz="4"/>
+                <w:right w:val="single" w:color="auto" w:sz="4"/>
+                <w:insideH w:val="single" w:color="auto" w:sz="4"/>
+                <w:insideV w:val="single" w:color="auto" w:sz="4"/>
+              </w:tblBorders>
+              <w:tblLayout w:type="fixed"/>
+            </w:tblPr>
+            <w:tblGrid>
+              <w:gridCol w:w="1780"/>
+              <w:gridCol w:w="1220"/>
+            </w:tblGrid>
+            <w:tr>
+              <w:trPr>
+                <w:tblHeader/>
+              </w:trPr>
+              <w:tc>
+                <w:tcPr>
+                  <w:tcW w:type="dxa" w:w="1780"/>
+                  <w:tcMar>
+                    <w:top w:type="dxa" w:w="40"/>
+                    <w:left w:type="dxa" w:w="100"/>
+                    <w:bottom w:type="dxa" w:w="40"/>
+                    <w:right w:type="dxa" w:w="100"/>
+                  </w:tcMar>
+                  <w:vAlign w:val="center"/>
+                </w:tcPr>
+                <w:p>
+                  <w:pPr>
+                    <w:keepNext/>
+                  </w:pPr>
+                  <w:r>
+                    <w:rPr>
+                      <w:rFonts w:ascii="Times New Roman" w:cs="Times New Roman" w:eastAsia="Times New Roman" w:hAnsi="Times New Roman"/>
+                      <w:b/>
+                      <w:bCs/>
+                      <w:sz w:val="24"/>
+                      <w:szCs w:val="24"/>
+                    </w:rPr>
+                    <w:t xml:space="preserve">Страна</w:t>
+                  </w:r>
+                </w:p>
+              </w:tc>
+              <w:tc>
+                <w:tcPr>
+                  <w:tcW w:type="dxa" w:w="1220"/>
+                  <w:tcMar>
+                    <w:top w:type="dxa" w:w="40"/>
+                    <w:left w:type="dxa" w:w="100"/>
+                    <w:bottom w:type="dxa" w:w="40"/>
+                    <w:right w:type="dxa" w:w="100"/>
+                  </w:tcMar>
+                  <w:vAlign w:val="center"/>
+                </w:tcPr>
+                <w:p>
+                  <w:pPr>
+                    <w:keepNext/>
+                  </w:pPr>
+                  <w:r>
+                    <w:rPr>
+                      <w:rFonts w:ascii="Times New Roman" w:cs="Times New Roman" w:eastAsia="Times New Roman" w:hAnsi="Times New Roman"/>
+                      <w:b/>
+                      <w:bCs/>
+                      <w:sz w:val="24"/>
+                      <w:szCs w:val="24"/>
+                    </w:rPr>
+                    <w:t xml:space="preserve">Столица</w:t>
+                  </w:r>
+                </w:p>
+              </w:tc>
+            </w:tr>
+            <w:tr>
+              <w:trPr>
+                <w:cantSplit/>
+              </w:trPr>
+              <w:tc>
+                <w:tcPr>
+                  <w:tcW w:type="dxa" w:w="1780"/>
+                  <w:tcMar>
+                    <w:top w:type="dxa" w:w="40"/>
+                    <w:left w:type="dxa" w:w="100"/>
+                    <w:bottom w:type="dxa" w:w="40"/>
+                    <w:right w:type="dxa" w:w="100"/>
+                  </w:tcMar>
+                  <w:vAlign w:val="center"/>
+                </w:tcPr>
+                <w:p>
+                  <w:pPr>
+                    <w:keepNext/>
+                  </w:pPr>
+                  <w:r>
+                    <w:rPr>
+                      <w:rFonts w:ascii="Times New Roman" w:cs="Times New Roman" w:eastAsia="Times New Roman" w:hAnsi="Times New Roman"/>
+                      <w:b w:val="false"/>
+                      <w:bCs w:val="false"/>
+                      <w:sz w:val="24"/>
+                      <w:szCs w:val="24"/>
+                    </w:rPr>
+                    <w:t xml:space="preserve">Грузия</w:t>
+                  </w:r>
+                </w:p>
+              </w:tc>
+              <w:tc>
+                <w:tcPr>
+                  <w:tcW w:type="dxa" w:w="1220"/>
+                  <w:tcMar>
+                    <w:top w:type="dxa" w:w="40"/>
+                    <w:left w:type="dxa" w:w="100"/>
+                    <w:bottom w:type="dxa" w:w="40"/>
+                    <w:right w:type="dxa" w:w="100"/>
+                  </w:tcMar>
+                  <w:vAlign w:val="center"/>
+                </w:tcPr>
+                <w:p>
+                  <w:pPr>
+                    <w:keepNext/>
+                  </w:pPr>
+                  <w:r>
+                    <w:rPr>
+                      <w:rFonts w:ascii="Times New Roman" w:cs="Times New Roman" w:eastAsia="Times New Roman" w:hAnsi="Times New Roman"/>
+                      <w:b w:val="false"/>
+                      <w:bCs w:val="false"/>
+                      <w:sz w:val="24"/>
+                      <w:szCs w:val="24"/>
+                    </w:rPr>
+                    <w:t xml:space="preserve">Тбилиси</w:t>
+                  </w:r>
+                </w:p>
+              </w:tc>
+            </w:tr>
+            <w:tr>
+              <w:trPr>
+                <w:cantSplit/>
+              </w:trPr>
+              <w:tc>
+                <w:tcPr>
+                  <w:tcW w:type="dxa" w:w="1780"/>
+                  <w:tcMar>
+                    <w:top w:type="dxa" w:w="40"/>
+                    <w:left w:type="dxa" w:w="100"/>
+                    <w:bottom w:type="dxa" w:w="40"/>
+                    <w:right w:type="dxa" w:w="100"/>
+                  </w:tcMar>
+                  <w:vAlign w:val="center"/>
+                </w:tcPr>
+                <w:p>
+                  <w:pPr>
+                    <w:keepNext/>
+                  </w:pPr>
+                  <w:r>
+                    <w:rPr>
+                      <w:rFonts w:ascii="Times New Roman" w:cs="Times New Roman" w:eastAsia="Times New Roman" w:hAnsi="Times New Roman"/>
+                      <w:b w:val="false"/>
+                      <w:bCs w:val="false"/>
+                      <w:sz w:val="24"/>
+                      <w:szCs w:val="24"/>
+                    </w:rPr>
+                    <w:t xml:space="preserve">Казахстан</w:t>
+                  </w:r>
+                </w:p>
+              </w:tc>
+              <w:tc>
+                <w:tcPr>
+                  <w:tcW w:type="dxa" w:w="1220"/>
+                  <w:tcMar>
+                    <w:top w:type="dxa" w:w="40"/>
+                    <w:left w:type="dxa" w:w="100"/>
+                    <w:bottom w:type="dxa" w:w="40"/>
+                    <w:right w:type="dxa" w:w="100"/>
+                  </w:tcMar>
+                  <w:vAlign w:val="center"/>
+                </w:tcPr>
+                <w:p>
+                  <w:pPr>
+                    <w:keepNext/>
+                  </w:pPr>
+                  <w:r>
+                    <w:rPr>
+                      <w:rFonts w:ascii="Times New Roman" w:cs="Times New Roman" w:eastAsia="Times New Roman" w:hAnsi="Times New Roman"/>
+                      <w:b w:val="false"/>
+                      <w:bCs w:val="false"/>
+                      <w:sz w:val="24"/>
+                      <w:szCs w:val="24"/>
+                    </w:rPr>
+                    <w:t xml:space="preserve">Астана</w:t>
+                  </w:r>
+                </w:p>
+              </w:tc>
+            </w:tr>
+            <w:tr>
+              <w:trPr>
+                <w:cantSplit/>
+              </w:trPr>
+              <w:tc>
+                <w:tcPr>
+                  <w:tcW w:type="dxa" w:w="1780"/>
+                  <w:tcMar>
+                    <w:top w:type="dxa" w:w="40"/>
+                    <w:left w:type="dxa" w:w="100"/>
+                    <w:bottom w:type="dxa" w:w="40"/>
+                    <w:right w:type="dxa" w:w="100"/>
+                  </w:tcMar>
+                  <w:vAlign w:val="center"/>
+                </w:tcPr>
+                <w:p>
+                  <w:pPr>
+                    <w:keepNext/>
+                  </w:pPr>
+                  <w:r>
+                    <w:rPr>
+                      <w:rFonts w:ascii="Times New Roman" w:cs="Times New Roman" w:eastAsia="Times New Roman" w:hAnsi="Times New Roman"/>
+                      <w:b w:val="false"/>
+                      <w:bCs w:val="false"/>
+                      <w:sz w:val="24"/>
+                      <w:szCs w:val="24"/>
+                    </w:rPr>
+                    <w:t xml:space="preserve">Кыргызстан</w:t>
+                  </w:r>
+                </w:p>
+              </w:tc>
+              <w:tc>
+                <w:tcPr>
+                  <w:tcW w:type="dxa" w:w="1220"/>
+                  <w:tcMar>
+                    <w:top w:type="dxa" w:w="40"/>
+                    <w:left w:type="dxa" w:w="100"/>
+                    <w:bottom w:type="dxa" w:w="40"/>
+                    <w:right w:type="dxa" w:w="100"/>
+                  </w:tcMar>
+                  <w:vAlign w:val="center"/>
+                </w:tcPr>
+                <w:p>
+                  <w:pPr>
+                    <w:keepNext/>
+                  </w:pPr>
+                  <w:r>
+                    <w:rPr>
+                      <w:rFonts w:ascii="Times New Roman" w:cs="Times New Roman" w:eastAsia="Times New Roman" w:hAnsi="Times New Roman"/>
+                      <w:b w:val="false"/>
+                      <w:bCs w:val="false"/>
+                      <w:sz w:val="24"/>
+                      <w:szCs w:val="24"/>
+                    </w:rPr>
+                    <w:t xml:space="preserve">Бишкек</w:t>
+                  </w:r>
+                </w:p>
+              </w:tc>
+            </w:tr>
+            <w:tr>
+              <w:trPr>
+                <w:cantSplit/>
+              </w:trPr>
+              <w:tc>
+                <w:tcPr>
+                  <w:tcW w:type="dxa" w:w="1780"/>
+                  <w:tcMar>
+                    <w:top w:type="dxa" w:w="40"/>
+                    <w:left w:type="dxa" w:w="100"/>
+                    <w:bottom w:type="dxa" w:w="40"/>
+                    <w:right w:type="dxa" w:w="100"/>
+                  </w:tcMar>
+                  <w:vAlign w:val="center"/>
+                </w:tcPr>
+                <w:p>
+                  <w:pPr>
+                    <w:keepNext/>
+                  </w:pPr>
+                  <w:r>
+                    <w:rPr>
+                      <w:rFonts w:ascii="Times New Roman" w:cs="Times New Roman" w:eastAsia="Times New Roman" w:hAnsi="Times New Roman"/>
+                      <w:b w:val="false"/>
+                      <w:bCs w:val="false"/>
+                      <w:sz w:val="24"/>
+                      <w:szCs w:val="24"/>
+                    </w:rPr>
+                    <w:t xml:space="preserve">Латвия</w:t>
+                  </w:r>
+                </w:p>
+              </w:tc>
+              <w:tc>
+                <w:tcPr>
+                  <w:tcW w:type="dxa" w:w="1220"/>
+                  <w:tcMar>
+                    <w:top w:type="dxa" w:w="40"/>
+                    <w:left w:type="dxa" w:w="100"/>
+                    <w:bottom w:type="dxa" w:w="40"/>
+                    <w:right w:type="dxa" w:w="100"/>
+                  </w:tcMar>
+                  <w:vAlign w:val="center"/>
+                </w:tcPr>
+                <w:p>
+                  <w:pPr>
+                    <w:keepNext/>
+                  </w:pPr>
+                  <w:r>
+                    <w:rPr>
+                      <w:rFonts w:ascii="Times New Roman" w:cs="Times New Roman" w:eastAsia="Times New Roman" w:hAnsi="Times New Roman"/>
+                      <w:b w:val="false"/>
+                      <w:bCs w:val="false"/>
+                      <w:sz w:val="24"/>
+                      <w:szCs w:val="24"/>
+                    </w:rPr>
+                    <w:t xml:space="preserve">Рига</w:t>
+                  </w:r>
+                </w:p>
+              </w:tc>
+            </w:tr>
+            <w:tr>
+              <w:trPr>
+                <w:cantSplit/>
+              </w:trPr>
+              <w:tc>
+                <w:tcPr>
+                  <w:tcW w:type="dxa" w:w="1780"/>
+                  <w:tcMar>
+                    <w:top w:type="dxa" w:w="40"/>
+                    <w:left w:type="dxa" w:w="100"/>
+                    <w:bottom w:type="dxa" w:w="40"/>
+                    <w:right w:type="dxa" w:w="100"/>
+                  </w:tcMar>
+                  <w:vAlign w:val="center"/>
+                </w:tcPr>
+                <w:p>
+                  <w:pPr>
+                    <w:keepNext/>
+                  </w:pPr>
+                  <w:r>
+                    <w:rPr>
+                      <w:rFonts w:ascii="Times New Roman" w:cs="Times New Roman" w:eastAsia="Times New Roman" w:hAnsi="Times New Roman"/>
+                      <w:b w:val="false"/>
+                      <w:bCs w:val="false"/>
+                      <w:sz w:val="24"/>
+                      <w:szCs w:val="24"/>
+                    </w:rPr>
+                    <w:t xml:space="preserve">Литва</w:t>
+                  </w:r>
+                </w:p>
+              </w:tc>
+              <w:tc>
+                <w:tcPr>
+                  <w:tcW w:type="dxa" w:w="1220"/>
+                  <w:tcMar>
+                    <w:top w:type="dxa" w:w="40"/>
+                    <w:left w:type="dxa" w:w="100"/>
+                    <w:bottom w:type="dxa" w:w="40"/>
+                    <w:right w:type="dxa" w:w="100"/>
+                  </w:tcMar>
+                  <w:vAlign w:val="center"/>
+                </w:tcPr>
+                <w:p>
+                  <w:pPr>
+                    <w:keepNext/>
+                  </w:pPr>
+                  <w:r>
+                    <w:rPr>
+                      <w:rFonts w:ascii="Times New Roman" w:cs="Times New Roman" w:eastAsia="Times New Roman" w:hAnsi="Times New Roman"/>
+                      <w:b w:val="false"/>
+                      <w:bCs w:val="false"/>
+                      <w:sz w:val="24"/>
+                      <w:szCs w:val="24"/>
+                    </w:rPr>
+                    <w:t xml:space="preserve">Вильнюс</w:t>
+                  </w:r>
+                </w:p>
+              </w:tc>
+            </w:tr>
+            <w:tr>
+              <w:trPr>
+                <w:cantSplit/>
+              </w:trPr>
+              <w:tc>
+                <w:tcPr>
+                  <w:tcW w:type="dxa" w:w="1780"/>
+                  <w:tcMar>
+                    <w:top w:type="dxa" w:w="40"/>
+                    <w:left w:type="dxa" w:w="100"/>
+                    <w:bottom w:type="dxa" w:w="40"/>
+                    <w:right w:type="dxa" w:w="100"/>
+                  </w:tcMar>
+                  <w:vAlign w:val="center"/>
+                </w:tcPr>
+                <w:p>
+                  <w:pPr>
+                    <w:keepNext/>
+                  </w:pPr>
+                  <w:r>
+                    <w:rPr>
+                      <w:rFonts w:ascii="Times New Roman" w:cs="Times New Roman" w:eastAsia="Times New Roman" w:hAnsi="Times New Roman"/>
+                      <w:b w:val="false"/>
+                      <w:bCs w:val="false"/>
+                      <w:sz w:val="24"/>
+                      <w:szCs w:val="24"/>
+                    </w:rPr>
+                    <w:t xml:space="preserve">Молдова</w:t>
+                  </w:r>
+                </w:p>
+              </w:tc>
+              <w:tc>
+                <w:tcPr>
+                  <w:tcW w:type="dxa" w:w="1220"/>
+                  <w:tcMar>
+                    <w:top w:type="dxa" w:w="40"/>
+                    <w:left w:type="dxa" w:w="100"/>
+                    <w:bottom w:type="dxa" w:w="40"/>
+                    <w:right w:type="dxa" w:w="100"/>
+                  </w:tcMar>
+                  <w:vAlign w:val="center"/>
+                </w:tcPr>
+                <w:p>
+                  <w:pPr>
+                    <w:keepNext/>
+                  </w:pPr>
+                  <w:r>
+                    <w:rPr>
+                      <w:rFonts w:ascii="Times New Roman" w:cs="Times New Roman" w:eastAsia="Times New Roman" w:hAnsi="Times New Roman"/>
+                      <w:b w:val="false"/>
+                      <w:bCs w:val="false"/>
+                      <w:sz w:val="24"/>
+                      <w:szCs w:val="24"/>
+                    </w:rPr>
+                    <w:t xml:space="preserve">Кишинев</w:t>
+                  </w:r>
+                </w:p>
+              </w:tc>
+            </w:tr>
+            <w:tr>
+              <w:trPr>
+                <w:cantSplit/>
+              </w:trPr>
+              <w:tc>
+                <w:tcPr>
+                  <w:tcW w:type="dxa" w:w="1780"/>
+                  <w:tcMar>
+                    <w:top w:type="dxa" w:w="40"/>
+                    <w:left w:type="dxa" w:w="100"/>
+                    <w:bottom w:type="dxa" w:w="40"/>
+                    <w:right w:type="dxa" w:w="100"/>
+                  </w:tcMar>
+                  <w:vAlign w:val="center"/>
+                </w:tcPr>
+                <w:p>
+                  <w:pPr>
+                    <w:keepNext/>
+                  </w:pPr>
+                  <w:r>
+                    <w:rPr>
+                      <w:rFonts w:ascii="Times New Roman" w:cs="Times New Roman" w:eastAsia="Times New Roman" w:hAnsi="Times New Roman"/>
+                      <w:b w:val="false"/>
+                      <w:bCs w:val="false"/>
+                      <w:sz w:val="24"/>
+                      <w:szCs w:val="24"/>
+                    </w:rPr>
+                    <w:t xml:space="preserve">Россия</w:t>
+                  </w:r>
+                </w:p>
+              </w:tc>
+              <w:tc>
+                <w:tcPr>
+                  <w:tcW w:type="dxa" w:w="1220"/>
+                  <w:tcMar>
+                    <w:top w:type="dxa" w:w="40"/>
+                    <w:left w:type="dxa" w:w="100"/>
+                    <w:bottom w:type="dxa" w:w="40"/>
+                    <w:right w:type="dxa" w:w="100"/>
+                  </w:tcMar>
+                  <w:vAlign w:val="center"/>
+                </w:tcPr>
+                <w:p>
+                  <w:pPr>
+                    <w:keepNext/>
+                  </w:pPr>
+                  <w:r>
+                    <w:rPr>
+                      <w:rFonts w:ascii="Times New Roman" w:cs="Times New Roman" w:eastAsia="Times New Roman" w:hAnsi="Times New Roman"/>
+                      <w:b w:val="false"/>
+                      <w:bCs w:val="false"/>
+                      <w:sz w:val="24"/>
+                      <w:szCs w:val="24"/>
+                    </w:rPr>
+                    <w:t xml:space="preserve">Москва</w:t>
+                  </w:r>
+                </w:p>
+              </w:tc>
+            </w:tr>
+            <w:tr>
+              <w:trPr>
+                <w:cantSplit/>
+              </w:trPr>
+              <w:tc>
+                <w:tcPr>
+                  <w:tcW w:type="dxa" w:w="1780"/>
+                  <w:tcMar>
+                    <w:top w:type="dxa" w:w="40"/>
+                    <w:left w:type="dxa" w:w="100"/>
+                    <w:bottom w:type="dxa" w:w="40"/>
+                    <w:right w:type="dxa" w:w="100"/>
+                  </w:tcMar>
+                  <w:vAlign w:val="center"/>
+                </w:tcPr>
+                <w:p>
+                  <w:pPr>
+                    <w:keepNext/>
+                  </w:pPr>
+                  <w:r>
+                    <w:rPr>
+                      <w:rFonts w:ascii="Times New Roman" w:cs="Times New Roman" w:eastAsia="Times New Roman" w:hAnsi="Times New Roman"/>
+                      <w:b w:val="false"/>
+                      <w:bCs w:val="false"/>
+                      <w:sz w:val="24"/>
+                      <w:szCs w:val="24"/>
+                    </w:rPr>
+                    <w:t xml:space="preserve">Таджикистан</w:t>
+                  </w:r>
+                </w:p>
+              </w:tc>
+              <w:tc>
+                <w:tcPr>
+                  <w:tcW w:type="dxa" w:w="1220"/>
+                  <w:tcMar>
+                    <w:top w:type="dxa" w:w="40"/>
+                    <w:left w:type="dxa" w:w="100"/>
+                    <w:bottom w:type="dxa" w:w="40"/>
+                    <w:right w:type="dxa" w:w="100"/>
+                  </w:tcMar>
+                  <w:vAlign w:val="center"/>
+                </w:tcPr>
+                <w:p>
+                  <w:pPr>
+                    <w:keepNext/>
+                  </w:pPr>
+                  <w:r>
+                    <w:rPr>
+                      <w:rFonts w:ascii="Times New Roman" w:cs="Times New Roman" w:eastAsia="Times New Roman" w:hAnsi="Times New Roman"/>
+                      <w:b w:val="false"/>
+                      <w:bCs w:val="false"/>
+                      <w:sz w:val="24"/>
+                      <w:szCs w:val="24"/>
+                    </w:rPr>
+                    <w:t xml:space="preserve">Душанбе</w:t>
+                  </w:r>
+                </w:p>
+              </w:tc>
+            </w:tr>
+            <w:tr>
+              <w:trPr>
+                <w:cantSplit/>
+              </w:trPr>
+              <w:tc>
+                <w:tcPr>
+                  <w:tcW w:type="dxa" w:w="1780"/>
+                  <w:tcMar>
+                    <w:top w:type="dxa" w:w="40"/>
+                    <w:left w:type="dxa" w:w="100"/>
+                    <w:bottom w:type="dxa" w:w="40"/>
+                    <w:right w:type="dxa" w:w="100"/>
+                  </w:tcMar>
+                  <w:vAlign w:val="center"/>
+                </w:tcPr>
+                <w:p>
+                  <w:pPr>
+                    <w:keepNext/>
+                  </w:pPr>
+                  <w:r>
+                    <w:rPr>
+                      <w:rFonts w:ascii="Times New Roman" w:cs="Times New Roman" w:eastAsia="Times New Roman" w:hAnsi="Times New Roman"/>
+                      <w:b w:val="false"/>
+                      <w:bCs w:val="false"/>
+                      <w:sz w:val="24"/>
+                      <w:szCs w:val="24"/>
+                    </w:rPr>
+                    <w:t xml:space="preserve">Туркменистан</w:t>
+                  </w:r>
+                </w:p>
+              </w:tc>
+              <w:tc>
+                <w:tcPr>
+                  <w:tcW w:type="dxa" w:w="1220"/>
+                  <w:tcMar>
+                    <w:top w:type="dxa" w:w="40"/>
+                    <w:left w:type="dxa" w:w="100"/>
+                    <w:bottom w:type="dxa" w:w="40"/>
+                    <w:right w:type="dxa" w:w="100"/>
+                  </w:tcMar>
+                  <w:vAlign w:val="center"/>
+                </w:tcPr>
+                <w:p>
+                  <w:pPr>
+                    <w:keepNext/>
+                  </w:pPr>
+                  <w:r>
+                    <w:rPr>
+                      <w:rFonts w:ascii="Times New Roman" w:cs="Times New Roman" w:eastAsia="Times New Roman" w:hAnsi="Times New Roman"/>
+                      <w:b w:val="false"/>
+                      <w:bCs w:val="false"/>
+                      <w:sz w:val="24"/>
+                      <w:szCs w:val="24"/>
+                    </w:rPr>
+                    <w:t xml:space="preserve">Ашхабад</w:t>
+                  </w:r>
+                </w:p>
+              </w:tc>
+            </w:tr>
+            <w:tr>
+              <w:trPr>
+                <w:cantSplit/>
+              </w:trPr>
+              <w:tc>
+                <w:tcPr>
+                  <w:tcW w:type="dxa" w:w="1780"/>
+                  <w:tcMar>
+                    <w:top w:type="dxa" w:w="40"/>
+                    <w:left w:type="dxa" w:w="100"/>
+                    <w:bottom w:type="dxa" w:w="40"/>
+                    <w:right w:type="dxa" w:w="100"/>
+                  </w:tcMar>
+                  <w:vAlign w:val="center"/>
+                </w:tcPr>
+                <w:p>
+                  <w:pPr>
+                    <w:keepNext/>
+                  </w:pPr>
+                  <w:r>
+                    <w:rPr>
+                      <w:rFonts w:ascii="Times New Roman" w:cs="Times New Roman" w:eastAsia="Times New Roman" w:hAnsi="Times New Roman"/>
+                      <w:b w:val="false"/>
+                      <w:bCs w:val="false"/>
+                      <w:sz w:val="24"/>
+                      <w:szCs w:val="24"/>
+                    </w:rPr>
+                    <w:t xml:space="preserve">Узбекистан</w:t>
+                  </w:r>
+                </w:p>
+              </w:tc>
+              <w:tc>
+                <w:tcPr>
+                  <w:tcW w:type="dxa" w:w="1220"/>
+                  <w:tcMar>
+                    <w:top w:type="dxa" w:w="40"/>
+                    <w:left w:type="dxa" w:w="100"/>
+                    <w:bottom w:type="dxa" w:w="40"/>
+                    <w:right w:type="dxa" w:w="100"/>
+                  </w:tcMar>
+                  <w:vAlign w:val="center"/>
+                </w:tcPr>
+                <w:p>
+                  <w:pPr>
+                    <w:keepNext/>
+                  </w:pPr>
+                  <w:r>
+                    <w:rPr>
+                      <w:rFonts w:ascii="Times New Roman" w:cs="Times New Roman" w:eastAsia="Times New Roman" w:hAnsi="Times New Roman"/>
+                      <w:b w:val="false"/>
+                      <w:bCs w:val="false"/>
+                      <w:sz w:val="24"/>
+                      <w:szCs w:val="24"/>
+                    </w:rPr>
+                    <w:t xml:space="preserve">Ташкент</w:t>
+                  </w:r>
+                </w:p>
+              </w:tc>
+            </w:tr>
+          </w:tbl>
+          <w:p/>
+        </w:tc>
+        <w:tc>
+          <w:tcPr>
+            <w:tcW w:type="dxa" w:w="3100"/>
+            <w:tcBorders>
+              <w:top w:val="none" w:color="FFFFFF" w:sz="0"/>
+              <w:left w:val="none" w:color="FFFFFF" w:sz="0"/>
+              <w:bottom w:val="none" w:color="FFFFFF" w:sz="0"/>
+              <w:right w:val="none" w:color="FFFFFF" w:sz="0"/>
+            </w:tcBorders>
+            <w:vAlign w:val="top"/>
+          </w:tcPr>
+          <w:p>
+            <w:pPr>
+              <w:keepNext/>
+              <w:jc w:val="center"/>
+            </w:pPr>
+            <w:r>
+              <w:rPr>
+                <w:rFonts w:ascii="Times New Roman" w:cs="Times New Roman" w:eastAsia="Times New Roman" w:hAnsi="Times New Roman"/>
+                <w:b/>
+                <w:bCs/>
+                <w:sz w:val="28"/>
+                <w:szCs w:val="28"/>
+              </w:rPr>
+              <w:t xml:space="preserve">C</w:t>
+            </w:r>
+          </w:p>
+          <w:tbl>
+            <w:tblPr>
+              <w:tblW w:type="dxa" w:w="3000"/>
+              <w:jc w:val="center"/>
+              <w:tblBorders>
+                <w:top w:val="single" w:color="auto" w:sz="4"/>
+                <w:left w:val="single" w:color="auto" w:sz="4"/>
+                <w:bottom w:val="single" w:color="auto" w:sz="4"/>
+                <w:right w:val="single" w:color="auto" w:sz="4"/>
+                <w:insideH w:val="single" w:color="auto" w:sz="4"/>
+                <w:insideV w:val="single" w:color="auto" w:sz="4"/>
+              </w:tblBorders>
+              <w:tblLayout w:type="fixed"/>
+            </w:tblPr>
+            <w:tblGrid>
+              <w:gridCol w:w="1780"/>
+              <w:gridCol w:w="1220"/>
+            </w:tblGrid>
+            <w:tr>
+              <w:trPr>
+                <w:tblHeader/>
+              </w:trPr>
+              <w:tc>
+                <w:tcPr>
+                  <w:tcW w:type="dxa" w:w="1780"/>
+                  <w:tcMar>
+                    <w:top w:type="dxa" w:w="40"/>
+                    <w:left w:type="dxa" w:w="100"/>
+                    <w:bottom w:type="dxa" w:w="40"/>
+                    <w:right w:type="dxa" w:w="100"/>
+                  </w:tcMar>
+                  <w:vAlign w:val="center"/>
+                </w:tcPr>
+                <w:p>
+                  <w:pPr>
+                    <w:keepNext/>
+                  </w:pPr>
+                  <w:r>
+                    <w:rPr>
+                      <w:rFonts w:ascii="Times New Roman" w:cs="Times New Roman" w:eastAsia="Times New Roman" w:hAnsi="Times New Roman"/>
+                      <w:b/>
+                      <w:bCs/>
+                      <w:sz w:val="24"/>
+                      <w:szCs w:val="24"/>
+                    </w:rPr>
+                    <w:t xml:space="preserve">Страна</w:t>
+                  </w:r>
+                </w:p>
+              </w:tc>
+              <w:tc>
+                <w:tcPr>
+                  <w:tcW w:type="dxa" w:w="1220"/>
+                  <w:tcMar>
+                    <w:top w:type="dxa" w:w="40"/>
+                    <w:left w:type="dxa" w:w="100"/>
+                    <w:bottom w:type="dxa" w:w="40"/>
+                    <w:right w:type="dxa" w:w="100"/>
+                  </w:tcMar>
+                  <w:vAlign w:val="center"/>
+                </w:tcPr>
+                <w:p>
+                  <w:pPr>
+                    <w:keepNext/>
+                  </w:pPr>
+                  <w:r>
+                    <w:rPr>
+                      <w:rFonts w:ascii="Times New Roman" w:cs="Times New Roman" w:eastAsia="Times New Roman" w:hAnsi="Times New Roman"/>
+                      <w:b/>
+                      <w:bCs/>
+                      <w:sz w:val="24"/>
+                      <w:szCs w:val="24"/>
+                    </w:rPr>
+                    <w:t xml:space="preserve">Столица</w:t>
+                  </w:r>
+                </w:p>
+              </w:tc>
+            </w:tr>
+            <w:tr>
+              <w:trPr>
+                <w:cantSplit/>
+              </w:trPr>
+              <w:tc>
+                <w:tcPr>
+                  <w:tcW w:type="dxa" w:w="1780"/>
+                  <w:tcMar>
+                    <w:top w:type="dxa" w:w="40"/>
+                    <w:left w:type="dxa" w:w="100"/>
+                    <w:bottom w:type="dxa" w:w="40"/>
+                    <w:right w:type="dxa" w:w="100"/>
+                  </w:tcMar>
+                  <w:vAlign w:val="center"/>
+                </w:tcPr>
+                <w:p>
+                  <w:pPr>
+                    <w:keepNext/>
+                  </w:pPr>
+                  <w:r>
+                    <w:rPr>
+                      <w:rFonts w:ascii="Times New Roman" w:cs="Times New Roman" w:eastAsia="Times New Roman" w:hAnsi="Times New Roman"/>
+                      <w:b w:val="false"/>
+                      <w:bCs w:val="false"/>
+                      <w:sz w:val="24"/>
+                      <w:szCs w:val="24"/>
+                    </w:rPr>
+                    <w:t xml:space="preserve">Грузия</w:t>
+                  </w:r>
+                </w:p>
+              </w:tc>
+              <w:tc>
+                <w:tcPr>
+                  <w:tcW w:type="dxa" w:w="1220"/>
+                  <w:tcMar>
+                    <w:top w:type="dxa" w:w="40"/>
+                    <w:left w:type="dxa" w:w="100"/>
+                    <w:bottom w:type="dxa" w:w="40"/>
+                    <w:right w:type="dxa" w:w="100"/>
+                  </w:tcMar>
+                  <w:vAlign w:val="center"/>
+                </w:tcPr>
+                <w:p>
+                  <w:pPr>
+                    <w:keepNext/>
+                  </w:pPr>
+                  <w:r>
+                    <w:rPr>
+                      <w:rFonts w:ascii="Times New Roman" w:cs="Times New Roman" w:eastAsia="Times New Roman" w:hAnsi="Times New Roman"/>
+                      <w:b w:val="false"/>
+                      <w:bCs w:val="false"/>
+                      <w:sz w:val="24"/>
+                      <w:szCs w:val="24"/>
+                    </w:rPr>
+                    <w:t xml:space="preserve">Тбилиси</w:t>
+                  </w:r>
+                </w:p>
+              </w:tc>
+            </w:tr>
+            <w:tr>
+              <w:trPr>
+                <w:cantSplit/>
+              </w:trPr>
+              <w:tc>
+                <w:tcPr>
+                  <w:tcW w:type="dxa" w:w="1780"/>
+                  <w:tcMar>
+                    <w:top w:type="dxa" w:w="40"/>
+                    <w:left w:type="dxa" w:w="100"/>
+                    <w:bottom w:type="dxa" w:w="40"/>
+                    <w:right w:type="dxa" w:w="100"/>
+                  </w:tcMar>
+                  <w:vAlign w:val="center"/>
+                </w:tcPr>
+                <w:p>
+                  <w:pPr>
+                    <w:keepNext/>
+                  </w:pPr>
+                  <w:r>
+                    <w:rPr>
+                      <w:rFonts w:ascii="Times New Roman" w:cs="Times New Roman" w:eastAsia="Times New Roman" w:hAnsi="Times New Roman"/>
+                      <w:b w:val="false"/>
+                      <w:bCs w:val="false"/>
+                      <w:sz w:val="24"/>
+                      <w:szCs w:val="24"/>
+                    </w:rPr>
+                    <w:t xml:space="preserve">Казахстан</w:t>
+                  </w:r>
+                </w:p>
+              </w:tc>
+              <w:tc>
+                <w:tcPr>
+                  <w:tcW w:type="dxa" w:w="1220"/>
+                  <w:tcMar>
+                    <w:top w:type="dxa" w:w="40"/>
+                    <w:left w:type="dxa" w:w="100"/>
+                    <w:bottom w:type="dxa" w:w="40"/>
+                    <w:right w:type="dxa" w:w="100"/>
+                  </w:tcMar>
+                  <w:vAlign w:val="center"/>
+                </w:tcPr>
+                <w:p>
+                  <w:pPr>
+                    <w:keepNext/>
+                  </w:pPr>
+                  <w:r>
+                    <w:rPr>
+                      <w:rFonts w:ascii="Times New Roman" w:cs="Times New Roman" w:eastAsia="Times New Roman" w:hAnsi="Times New Roman"/>
+                      <w:b w:val="false"/>
+                      <w:bCs w:val="false"/>
+                      <w:sz w:val="24"/>
+                      <w:szCs w:val="24"/>
+                    </w:rPr>
+                    <w:t xml:space="preserve">Астана</w:t>
+                  </w:r>
+                </w:p>
+              </w:tc>
+            </w:tr>
+            <w:tr>
+              <w:trPr>
+                <w:cantSplit/>
+              </w:trPr>
+              <w:tc>
+                <w:tcPr>
+                  <w:tcW w:type="dxa" w:w="1780"/>
+                  <w:tcMar>
+                    <w:top w:type="dxa" w:w="40"/>
+                    <w:left w:type="dxa" w:w="100"/>
+                    <w:bottom w:type="dxa" w:w="40"/>
+                    <w:right w:type="dxa" w:w="100"/>
+                  </w:tcMar>
+                  <w:vAlign w:val="center"/>
+                </w:tcPr>
+                <w:p>
+                  <w:pPr>
+                    <w:keepNext/>
+                  </w:pPr>
+                  <w:r>
+                    <w:rPr>
+                      <w:rFonts w:ascii="Times New Roman" w:cs="Times New Roman" w:eastAsia="Times New Roman" w:hAnsi="Times New Roman"/>
+                      <w:b w:val="false"/>
+                      <w:bCs w:val="false"/>
+                      <w:sz w:val="24"/>
+                      <w:szCs w:val="24"/>
+                    </w:rPr>
+                    <w:t xml:space="preserve">Кыргызстан</w:t>
+                  </w:r>
+                </w:p>
+              </w:tc>
+              <w:tc>
+                <w:tcPr>
+                  <w:tcW w:type="dxa" w:w="1220"/>
+                  <w:tcMar>
+                    <w:top w:type="dxa" w:w="40"/>
+                    <w:left w:type="dxa" w:w="100"/>
+                    <w:bottom w:type="dxa" w:w="40"/>
+                    <w:right w:type="dxa" w:w="100"/>
+                  </w:tcMar>
+                  <w:vAlign w:val="center"/>
+                </w:tcPr>
+                <w:p>
+                  <w:pPr>
+                    <w:keepNext/>
+                  </w:pPr>
+                  <w:r>
+                    <w:rPr>
+                      <w:rFonts w:ascii="Times New Roman" w:cs="Times New Roman" w:eastAsia="Times New Roman" w:hAnsi="Times New Roman"/>
+                      <w:b w:val="false"/>
+                      <w:bCs w:val="false"/>
+                      <w:sz w:val="24"/>
+                      <w:szCs w:val="24"/>
+                    </w:rPr>
+                    <w:t xml:space="preserve">Бишкек</w:t>
+                  </w:r>
+                </w:p>
+              </w:tc>
+            </w:tr>
+            <w:tr>
+              <w:trPr>
+                <w:cantSplit/>
+              </w:trPr>
+              <w:tc>
+                <w:tcPr>
+                  <w:tcW w:type="dxa" w:w="1780"/>
+                  <w:tcMar>
+                    <w:top w:type="dxa" w:w="40"/>
+                    <w:left w:type="dxa" w:w="100"/>
+                    <w:bottom w:type="dxa" w:w="40"/>
+                    <w:right w:type="dxa" w:w="100"/>
+                  </w:tcMar>
+                  <w:vAlign w:val="center"/>
+                </w:tcPr>
+                <w:p>
+                  <w:pPr>
+                    <w:keepNext/>
+                  </w:pPr>
+                  <w:r>
+                    <w:rPr>
+                      <w:rFonts w:ascii="Times New Roman" w:cs="Times New Roman" w:eastAsia="Times New Roman" w:hAnsi="Times New Roman"/>
+                      <w:b w:val="false"/>
+                      <w:bCs w:val="false"/>
+                      <w:sz w:val="24"/>
+                      <w:szCs w:val="24"/>
+                    </w:rPr>
+                    <w:t xml:space="preserve">Латвия</w:t>
+                  </w:r>
+                </w:p>
+              </w:tc>
+              <w:tc>
+                <w:tcPr>
+                  <w:tcW w:type="dxa" w:w="1220"/>
+                  <w:tcMar>
+                    <w:top w:type="dxa" w:w="40"/>
+                    <w:left w:type="dxa" w:w="100"/>
+                    <w:bottom w:type="dxa" w:w="40"/>
+                    <w:right w:type="dxa" w:w="100"/>
+                  </w:tcMar>
+                  <w:vAlign w:val="center"/>
+                </w:tcPr>
+                <w:p>
+                  <w:pPr>
+                    <w:keepNext/>
+                  </w:pPr>
+                  <w:r>
+                    <w:rPr>
+                      <w:rFonts w:ascii="Times New Roman" w:cs="Times New Roman" w:eastAsia="Times New Roman" w:hAnsi="Times New Roman"/>
+                      <w:b w:val="false"/>
+                      <w:bCs w:val="false"/>
+                      <w:sz w:val="24"/>
+                      <w:szCs w:val="24"/>
+                    </w:rPr>
+                    <w:t xml:space="preserve">Рига</w:t>
+                  </w:r>
+                </w:p>
+              </w:tc>
+            </w:tr>
+            <w:tr>
+              <w:trPr>
+                <w:cantSplit/>
+              </w:trPr>
+              <w:tc>
+                <w:tcPr>
+                  <w:tcW w:type="dxa" w:w="1780"/>
+                  <w:tcMar>
+                    <w:top w:type="dxa" w:w="40"/>
+                    <w:left w:type="dxa" w:w="100"/>
+                    <w:bottom w:type="dxa" w:w="40"/>
+                    <w:right w:type="dxa" w:w="100"/>
+                  </w:tcMar>
+                  <w:vAlign w:val="center"/>
+                </w:tcPr>
+                <w:p>
+                  <w:pPr>
+                    <w:keepNext/>
+                  </w:pPr>
+                  <w:r>
+                    <w:rPr>
+                      <w:rFonts w:ascii="Times New Roman" w:cs="Times New Roman" w:eastAsia="Times New Roman" w:hAnsi="Times New Roman"/>
+                      <w:b w:val="false"/>
+                      <w:bCs w:val="false"/>
+                      <w:sz w:val="24"/>
+                      <w:szCs w:val="24"/>
+                    </w:rPr>
+                    <w:t xml:space="preserve">Узбекистан</w:t>
+                  </w:r>
+                </w:p>
+              </w:tc>
+              <w:tc>
+                <w:tcPr>
+                  <w:tcW w:type="dxa" w:w="1220"/>
+                  <w:tcMar>
+                    <w:top w:type="dxa" w:w="40"/>
+                    <w:left w:type="dxa" w:w="100"/>
+                    <w:bottom w:type="dxa" w:w="40"/>
+                    <w:right w:type="dxa" w:w="100"/>
+                  </w:tcMar>
+                  <w:vAlign w:val="center"/>
+                </w:tcPr>
+                <w:p>
+                  <w:pPr>
+                    <w:keepNext/>
+                  </w:pPr>
+                  <w:r>
+                    <w:rPr>
+                      <w:rFonts w:ascii="Times New Roman" w:cs="Times New Roman" w:eastAsia="Times New Roman" w:hAnsi="Times New Roman"/>
+                      <w:b w:val="false"/>
+                      <w:bCs w:val="false"/>
+                      <w:sz w:val="24"/>
+                      <w:szCs w:val="24"/>
+                    </w:rPr>
+                    <w:t xml:space="preserve">Ташкент</w:t>
+                  </w:r>
+                </w:p>
+              </w:tc>
+            </w:tr>
+            <w:tr>
+              <w:trPr>
+                <w:cantSplit/>
+              </w:trPr>
+              <w:tc>
+                <w:tcPr>
+                  <w:tcW w:type="dxa" w:w="1780"/>
+                  <w:tcMar>
+                    <w:top w:type="dxa" w:w="40"/>
+                    <w:left w:type="dxa" w:w="100"/>
+                    <w:bottom w:type="dxa" w:w="40"/>
+                    <w:right w:type="dxa" w:w="100"/>
+                  </w:tcMar>
+                  <w:vAlign w:val="center"/>
+                </w:tcPr>
+                <w:p>
+                  <w:pPr>
+                    <w:keepNext/>
+                  </w:pPr>
+                  <w:r>
+                    <w:rPr>
+                      <w:rFonts w:ascii="Times New Roman" w:cs="Times New Roman" w:eastAsia="Times New Roman" w:hAnsi="Times New Roman"/>
+                      <w:b w:val="false"/>
+                      <w:bCs w:val="false"/>
+                      <w:sz w:val="24"/>
+                      <w:szCs w:val="24"/>
+                    </w:rPr>
+                    <w:t xml:space="preserve">Украина</w:t>
+                  </w:r>
+                </w:p>
+              </w:tc>
+              <w:tc>
+                <w:tcPr>
+                  <w:tcW w:type="dxa" w:w="1220"/>
+                  <w:tcMar>
+                    <w:top w:type="dxa" w:w="40"/>
+                    <w:left w:type="dxa" w:w="100"/>
+                    <w:bottom w:type="dxa" w:w="40"/>
+                    <w:right w:type="dxa" w:w="100"/>
+                  </w:tcMar>
+                  <w:vAlign w:val="center"/>
+                </w:tcPr>
+                <w:p>
+                  <w:pPr>
+                    <w:keepNext/>
+                  </w:pPr>
+                  <w:r>
+                    <w:rPr>
+                      <w:rFonts w:ascii="Times New Roman" w:cs="Times New Roman" w:eastAsia="Times New Roman" w:hAnsi="Times New Roman"/>
+                      <w:b w:val="false"/>
+                      <w:bCs w:val="false"/>
+                      <w:sz w:val="24"/>
+                      <w:szCs w:val="24"/>
+                    </w:rPr>
+                    <w:t xml:space="preserve">Киев</w:t>
+                  </w:r>
+                </w:p>
+              </w:tc>
+            </w:tr>
+            <w:tr>
+              <w:trPr>
+                <w:cantSplit/>
+              </w:trPr>
+              <w:tc>
+                <w:tcPr>
+                  <w:tcW w:type="dxa" w:w="1780"/>
+                  <w:tcMar>
+                    <w:top w:type="dxa" w:w="40"/>
+                    <w:left w:type="dxa" w:w="100"/>
+                    <w:bottom w:type="dxa" w:w="40"/>
+                    <w:right w:type="dxa" w:w="100"/>
+                  </w:tcMar>
+                  <w:vAlign w:val="center"/>
+                </w:tcPr>
+                <w:p>
+                  <w:pPr>
+                    <w:keepNext/>
+                  </w:pPr>
+                  <w:r>
+                    <w:rPr>
+                      <w:rFonts w:ascii="Times New Roman" w:cs="Times New Roman" w:eastAsia="Times New Roman" w:hAnsi="Times New Roman"/>
+                      <w:b w:val="false"/>
+                      <w:bCs w:val="false"/>
+                      <w:sz w:val="24"/>
+                      <w:szCs w:val="24"/>
+                    </w:rPr>
+                    <w:t xml:space="preserve">Эстония</w:t>
+                  </w:r>
+                </w:p>
+              </w:tc>
+              <w:tc>
+                <w:tcPr>
+                  <w:tcW w:type="dxa" w:w="1220"/>
+                  <w:tcMar>
+                    <w:top w:type="dxa" w:w="40"/>
+                    <w:left w:type="dxa" w:w="100"/>
+                    <w:bottom w:type="dxa" w:w="40"/>
+                    <w:right w:type="dxa" w:w="100"/>
+                  </w:tcMar>
+                  <w:vAlign w:val="center"/>
+                </w:tcPr>
+                <w:p>
+                  <w:pPr>
+                    <w:keepNext/>
+                  </w:pPr>
+                  <w:r>
+                    <w:rPr>
+                      <w:rFonts w:ascii="Times New Roman" w:cs="Times New Roman" w:eastAsia="Times New Roman" w:hAnsi="Times New Roman"/>
+                      <w:b w:val="false"/>
+                      <w:bCs w:val="false"/>
+                      <w:sz w:val="24"/>
+                      <w:szCs w:val="24"/>
+                    </w:rPr>
+                    <w:t xml:space="preserve">Таллин</w:t>
+                  </w:r>
+                </w:p>
+              </w:tc>
+            </w:tr>
+            <w:tr>
+              <w:trPr>
+                <w:cantSplit/>
+              </w:trPr>
+              <w:tc>
+                <w:tcPr>
+                  <w:tcW w:type="dxa" w:w="1780"/>
+                  <w:tcMar>
+                    <w:top w:type="dxa" w:w="40"/>
+                    <w:left w:type="dxa" w:w="100"/>
+                    <w:bottom w:type="dxa" w:w="40"/>
+                    <w:right w:type="dxa" w:w="100"/>
+                  </w:tcMar>
+                  <w:vAlign w:val="center"/>
+                </w:tcPr>
+                <w:p>
+                  <w:pPr>
+                    <w:keepNext/>
+                  </w:pPr>
+                  <w:r>
+                    <w:rPr>
+                      <w:rFonts w:ascii="Times New Roman" w:cs="Times New Roman" w:eastAsia="Times New Roman" w:hAnsi="Times New Roman"/>
+                      <w:b w:val="false"/>
+                      <w:bCs w:val="false"/>
+                      <w:sz w:val="24"/>
+                      <w:szCs w:val="24"/>
+                    </w:rPr>
+                    <w:t xml:space="preserve">Молдова</w:t>
+                  </w:r>
+                </w:p>
+              </w:tc>
+              <w:tc>
+                <w:tcPr>
+                  <w:tcW w:type="dxa" w:w="1220"/>
+                  <w:tcMar>
+                    <w:top w:type="dxa" w:w="40"/>
+                    <w:left w:type="dxa" w:w="100"/>
+                    <w:bottom w:type="dxa" w:w="40"/>
+                    <w:right w:type="dxa" w:w="100"/>
+                  </w:tcMar>
+                  <w:vAlign w:val="center"/>
+                </w:tcPr>
+                <w:p>
+                  <w:pPr>
+                    <w:keepNext/>
+                  </w:pPr>
+                  <w:r>
+                    <w:rPr>
+                      <w:rFonts w:ascii="Times New Roman" w:cs="Times New Roman" w:eastAsia="Times New Roman" w:hAnsi="Times New Roman"/>
+                      <w:b w:val="false"/>
+                      <w:bCs w:val="false"/>
+                      <w:sz w:val="24"/>
+                      <w:szCs w:val="24"/>
+                    </w:rPr>
+                    <w:t xml:space="preserve">Кишенев</w:t>
+                  </w:r>
+                </w:p>
+              </w:tc>
+            </w:tr>
+          </w:tbl>
+          <w:p/>
+        </w:tc>
+      </w:tr>
+    </w:tbl>
+    <w:p>
+      <w:pPr>
+        <w:spacing w:after="0" w:before="120" w:line="360"/>
+        <w:ind w:firstLine="709"/>
+        <w:jc w:val="both"/>
+      </w:pPr>
+      <w:r>
+        <w:rPr>
+          <w:rFonts w:ascii="Times New Roman" w:cs="Times New Roman" w:eastAsia="Times New Roman" w:hAnsi="Times New Roman"/>
+          <w:sz w:val="28"/>
+          <w:szCs w:val="28"/>
+        </w:rPr>
+        <w:t xml:space="preserve">Задание:</w:t>
+      </w:r>
+    </w:p>
+    <w:p>
+      <w:pPr>
+        <w:keepNext/>
+        <w:spacing w:after="120" w:before="60" w:line="360"/>
+        <w:jc w:val="center"/>
+      </w:pPr>
+      <w:r>
+        <w:rPr>
+          <w:rFonts w:ascii="Times New Roman" w:cs="Times New Roman" w:eastAsia="Times New Roman" w:hAnsi="Times New Roman"/>
+          <w:b/>
+          <w:bCs/>
+          <w:sz w:val="28"/>
+          <w:szCs w:val="28"/>
+        </w:rPr>
+        <w:t xml:space="preserve">(C – B) ∪ A</w:t>
+      </w:r>
+    </w:p>
+    <w:p>
+      <w:pPr>
+        <w:keepNext/>
+        <w:spacing w:after="120" w:before="60" w:line="360"/>
+        <w:jc w:val="center"/>
+      </w:pPr>
+      <w:r>
+        <w:rPr>
+          <w:rFonts w:ascii="Times New Roman" w:cs="Times New Roman" w:eastAsia="Times New Roman" w:hAnsi="Times New Roman"/>
+          <w:b/>
+          <w:bCs/>
+          <w:sz w:val="28"/>
+          <w:szCs w:val="28"/>
+        </w:rPr>
+        <w:t xml:space="preserve">M = A Where A.col_1 = ‘выбрать первые два элемента’</w:t>
+      </w:r>
+    </w:p>
+    <w:p>
+      <w:pPr>
+        <w:keepNext/>
+        <w:spacing w:after="120" w:before="60" w:line="360"/>
+        <w:jc w:val="center"/>
+      </w:pPr>
+      <w:r>
+        <w:rPr>
+          <w:rFonts w:ascii="Times New Roman" w:cs="Times New Roman" w:eastAsia="Times New Roman" w:hAnsi="Times New Roman"/>
+          <w:b/>
+          <w:bCs/>
+          <w:sz w:val="28"/>
+          <w:szCs w:val="28"/>
+        </w:rPr>
+        <w:t xml:space="preserve">N = B Where B.col_1 = ‘выбрать последние два элемента’</w:t>
+      </w:r>
+    </w:p>
+    <w:p>
+      <w:pPr>
+        <w:keepNext/>
+        <w:spacing w:after="120" w:before="60" w:line="360"/>
+        <w:jc w:val="center"/>
+      </w:pPr>
+      <w:r>
+        <w:rPr>
+          <w:rFonts w:ascii="Times New Roman" w:cs="Times New Roman" w:eastAsia="Times New Roman" w:hAnsi="Times New Roman"/>
+          <w:b/>
+          <w:bCs/>
+          <w:sz w:val="28"/>
+          <w:szCs w:val="28"/>
+        </w:rPr>
+        <w:t xml:space="preserve">(M × N) Projection {A.col_1, B.col_1}</w:t>
+      </w:r>
+    </w:p>
+    <w:p>
+      <w:pPr>
+        <w:spacing w:after="0" w:before="0" w:line="360"/>
+        <w:ind w:firstLine="709"/>
+        <w:jc w:val="both"/>
+      </w:pPr>
+      <w:r>
+        <w:rPr>
+          <w:rFonts w:ascii="Times New Roman" w:cs="Times New Roman" w:eastAsia="Times New Roman" w:hAnsi="Times New Roman"/>
+          <w:sz w:val="28"/>
+          <w:szCs w:val="28"/>
+        </w:rPr>
+        <w:t xml:space="preserve">Строку каждой таблицы рассматриваем как один элемент множества (кортеж).</w:t>
       </w:r>
     </w:p>
     <w:p>

</xml_diff>